<commit_message>
Status document: creator to partner program, roles, anti-scheme measures, partner economics, scripts
Co-Authored-By: Claude Sonnet 5.5 <noreply@anthropic.com>
Claude-Session: https://claude.ai/code/session_01TEBpQfqf9ErUdw2tuXqppw
</commit_message>
<xml_diff>
--- a/docs/mila-status-and-creator-plan.docx
+++ b/docs/mila-status-and-creator-plan.docx
@@ -47,7 +47,7 @@
           <w:sz w:val="22"/>
           <w:szCs w:val="22"/>
         </w:rPr>
-        <w:t xml:space="preserve">Prepared for Ryan, NorthCo. Written October 26, 2026, three days after launch.</w:t>
+        <w:t xml:space="preserve">Prepared for Ryan, NorthCo. Updated October 26, 2026, three days after launch.</w:t>
       </w:r>
     </w:p>
     <w:p>
@@ -134,14 +134,14 @@
           <w:sz w:val="22"/>
           <w:szCs w:val="22"/>
         </w:rPr>
-        <w:t xml:space="preserve">Creator partner program is built. </w:t>
+        <w:t xml:space="preserve">Creator and partner program is built. </w:t>
       </w:r>
       <w:r>
         <w:rPr>
           <w:sz w:val="22"/>
           <w:szCs w:val="22"/>
         </w:rPr>
-        <w:t xml:space="preserve">A Creators tab in Mila OS, a private page for each creator on milarealestate.app, daily reminders, and a one-click free month. It needs one database step from you (section 4).</w:t>
+        <w:t xml:space="preserve">Sarah can run it from Mila OS: find creators, give access, check videos, and see who is really using Mila. Ryan gives the free month and promotes partners. Partners get Mila free while they post monthly and earn a commission on their referrals.</w:t>
       </w:r>
     </w:p>
     <w:p>
@@ -1767,6 +1767,3295 @@
           <w:sz w:val="34"/>
           <w:szCs w:val="34"/>
         </w:rPr>
+        <w:t xml:space="preserve">3b. From creator to partner</w:t>
+      </w:r>
+    </w:p>
+    <w:p>
+      <w:pPr>
+        <w:pStyle w:val="Heading2"/>
+        <w:spacing w:after="100" w:before="240"/>
+      </w:pPr>
+      <w:r>
+        <w:rPr>
+          <w:b/>
+          <w:bCs/>
+          <w:color w:val="1B1830"/>
+          <w:sz w:val="26"/>
+          <w:szCs w:val="26"/>
+        </w:rPr>
+        <w:t xml:space="preserve">The two stages</w:t>
+      </w:r>
+    </w:p>
+    <w:tbl>
+      <w:tblPr>
+        <w:tblW w:type="dxa" w:w="9360"/>
+        <w:tblBorders>
+          <w:top w:val="single" w:color="auto" w:sz="4"/>
+          <w:left w:val="single" w:color="auto" w:sz="4"/>
+          <w:bottom w:val="single" w:color="auto" w:sz="4"/>
+          <w:right w:val="single" w:color="auto" w:sz="4"/>
+          <w:insideH w:val="single" w:color="auto" w:sz="4"/>
+          <w:insideV w:val="single" w:color="auto" w:sz="4"/>
+        </w:tblBorders>
+      </w:tblPr>
+      <w:tblGrid>
+        <w:gridCol w:w="1685"/>
+        <w:gridCol w:w="3838"/>
+        <w:gridCol w:w="3838"/>
+      </w:tblGrid>
+      <w:tr>
+        <w:trPr>
+          <w:tblHeader/>
+        </w:trPr>
+        <w:tc>
+          <w:tcPr>
+            <w:tcW w:type="dxa" w:w="1685"/>
+            <w:tcBorders>
+              <w:top w:val="single" w:color="D9D4F0" w:sz="4"/>
+              <w:left w:val="single" w:color="D9D4F0" w:sz="4"/>
+              <w:bottom w:val="single" w:color="D9D4F0" w:sz="4"/>
+              <w:right w:val="single" w:color="D9D4F0" w:sz="4"/>
+            </w:tcBorders>
+            <w:shd w:fill="EDE9FE" w:color="auto" w:val="clear"/>
+            <w:tcMar>
+              <w:top w:type="dxa" w:w="80"/>
+              <w:left w:type="dxa" w:w="120"/>
+              <w:bottom w:type="dxa" w:w="80"/>
+              <w:right w:type="dxa" w:w="120"/>
+            </w:tcMar>
+          </w:tcPr>
+          <w:p>
+            <w:r>
+              <w:rPr>
+                <w:b/>
+                <w:bCs/>
+                <w:sz w:val="20"/>
+                <w:szCs w:val="20"/>
+              </w:rPr>
+              <w:t xml:space="preserve"/>
+            </w:r>
+          </w:p>
+        </w:tc>
+        <w:tc>
+          <w:tcPr>
+            <w:tcW w:type="dxa" w:w="3838"/>
+            <w:tcBorders>
+              <w:top w:val="single" w:color="D9D4F0" w:sz="4"/>
+              <w:left w:val="single" w:color="D9D4F0" w:sz="4"/>
+              <w:bottom w:val="single" w:color="D9D4F0" w:sz="4"/>
+              <w:right w:val="single" w:color="D9D4F0" w:sz="4"/>
+            </w:tcBorders>
+            <w:shd w:fill="EDE9FE" w:color="auto" w:val="clear"/>
+            <w:tcMar>
+              <w:top w:type="dxa" w:w="80"/>
+              <w:left w:type="dxa" w:w="120"/>
+              <w:bottom w:type="dxa" w:w="80"/>
+              <w:right w:type="dxa" w:w="120"/>
+            </w:tcMar>
+          </w:tcPr>
+          <w:p>
+            <w:r>
+              <w:rPr>
+                <w:b/>
+                <w:bCs/>
+                <w:sz w:val="20"/>
+                <w:szCs w:val="20"/>
+              </w:rPr>
+              <w:t xml:space="preserve">Creator (first round)</w:t>
+            </w:r>
+          </w:p>
+        </w:tc>
+        <w:tc>
+          <w:tcPr>
+            <w:tcW w:type="dxa" w:w="3838"/>
+            <w:tcBorders>
+              <w:top w:val="single" w:color="D9D4F0" w:sz="4"/>
+              <w:left w:val="single" w:color="D9D4F0" w:sz="4"/>
+              <w:bottom w:val="single" w:color="D9D4F0" w:sz="4"/>
+              <w:right w:val="single" w:color="D9D4F0" w:sz="4"/>
+            </w:tcBorders>
+            <w:shd w:fill="EDE9FE" w:color="auto" w:val="clear"/>
+            <w:tcMar>
+              <w:top w:type="dxa" w:w="80"/>
+              <w:left w:type="dxa" w:w="120"/>
+              <w:bottom w:type="dxa" w:w="80"/>
+              <w:right w:type="dxa" w:w="120"/>
+            </w:tcMar>
+          </w:tcPr>
+          <w:p>
+            <w:r>
+              <w:rPr>
+                <w:b/>
+                <w:bCs/>
+                <w:sz w:val="20"/>
+                <w:szCs w:val="20"/>
+              </w:rPr>
+              <w:t xml:space="preserve">Partner (ongoing)</w:t>
+            </w:r>
+          </w:p>
+        </w:tc>
+      </w:tr>
+      <w:tr>
+        <w:tc>
+          <w:tcPr>
+            <w:tcW w:type="dxa" w:w="1685"/>
+            <w:tcBorders>
+              <w:top w:val="single" w:color="D9D4F0" w:sz="4"/>
+              <w:left w:val="single" w:color="D9D4F0" w:sz="4"/>
+              <w:bottom w:val="single" w:color="D9D4F0" w:sz="4"/>
+              <w:right w:val="single" w:color="D9D4F0" w:sz="4"/>
+            </w:tcBorders>
+            <w:tcMar>
+              <w:top w:type="dxa" w:w="80"/>
+              <w:left w:type="dxa" w:w="120"/>
+              <w:bottom w:type="dxa" w:w="80"/>
+              <w:right w:type="dxa" w:w="120"/>
+            </w:tcMar>
+          </w:tcPr>
+          <w:p>
+            <w:r>
+              <w:rPr>
+                <w:b w:val="false"/>
+                <w:bCs w:val="false"/>
+                <w:sz w:val="20"/>
+                <w:szCs w:val="20"/>
+              </w:rPr>
+              <w:t xml:space="preserve">What they do</w:t>
+            </w:r>
+          </w:p>
+        </w:tc>
+        <w:tc>
+          <w:tcPr>
+            <w:tcW w:type="dxa" w:w="3838"/>
+            <w:tcBorders>
+              <w:top w:val="single" w:color="D9D4F0" w:sz="4"/>
+              <w:left w:val="single" w:color="D9D4F0" w:sz="4"/>
+              <w:bottom w:val="single" w:color="D9D4F0" w:sz="4"/>
+              <w:right w:val="single" w:color="D9D4F0" w:sz="4"/>
+            </w:tcBorders>
+            <w:tcMar>
+              <w:top w:type="dxa" w:w="80"/>
+              <w:left w:type="dxa" w:w="120"/>
+              <w:bottom w:type="dxa" w:w="80"/>
+              <w:right w:type="dxa" w:w="120"/>
+            </w:tcMar>
+          </w:tcPr>
+          <w:p>
+            <w:r>
+              <w:rPr>
+                <w:b w:val="false"/>
+                <w:bCs w:val="false"/>
+                <w:sz w:val="20"/>
+                <w:szCs w:val="20"/>
+              </w:rPr>
+              <w:t xml:space="preserve">Post 3 videos in 14 days.</w:t>
+            </w:r>
+          </w:p>
+        </w:tc>
+        <w:tc>
+          <w:tcPr>
+            <w:tcW w:type="dxa" w:w="3838"/>
+            <w:tcBorders>
+              <w:top w:val="single" w:color="D9D4F0" w:sz="4"/>
+              <w:left w:val="single" w:color="D9D4F0" w:sz="4"/>
+              <w:bottom w:val="single" w:color="D9D4F0" w:sz="4"/>
+              <w:right w:val="single" w:color="D9D4F0" w:sz="4"/>
+            </w:tcBorders>
+            <w:tcMar>
+              <w:top w:type="dxa" w:w="80"/>
+              <w:left w:type="dxa" w:w="120"/>
+              <w:bottom w:type="dxa" w:w="80"/>
+              <w:right w:type="dxa" w:w="120"/>
+            </w:tcMar>
+          </w:tcPr>
+          <w:p>
+            <w:r>
+              <w:rPr>
+                <w:b w:val="false"/>
+                <w:bCs w:val="false"/>
+                <w:sz w:val="20"/>
+                <w:szCs w:val="20"/>
+              </w:rPr>
+              <w:t xml:space="preserve">Post 2 videos a month (you can change it per partner).</w:t>
+            </w:r>
+          </w:p>
+        </w:tc>
+      </w:tr>
+      <w:tr>
+        <w:tc>
+          <w:tcPr>
+            <w:tcW w:type="dxa" w:w="1685"/>
+            <w:tcBorders>
+              <w:top w:val="single" w:color="D9D4F0" w:sz="4"/>
+              <w:left w:val="single" w:color="D9D4F0" w:sz="4"/>
+              <w:bottom w:val="single" w:color="D9D4F0" w:sz="4"/>
+              <w:right w:val="single" w:color="D9D4F0" w:sz="4"/>
+            </w:tcBorders>
+            <w:tcMar>
+              <w:top w:type="dxa" w:w="80"/>
+              <w:left w:type="dxa" w:w="120"/>
+              <w:bottom w:type="dxa" w:w="80"/>
+              <w:right w:type="dxa" w:w="120"/>
+            </w:tcMar>
+          </w:tcPr>
+          <w:p>
+            <w:r>
+              <w:rPr>
+                <w:b w:val="false"/>
+                <w:bCs w:val="false"/>
+                <w:sz w:val="20"/>
+                <w:szCs w:val="20"/>
+              </w:rPr>
+              <w:t xml:space="preserve">What they get</w:t>
+            </w:r>
+          </w:p>
+        </w:tc>
+        <w:tc>
+          <w:tcPr>
+            <w:tcW w:type="dxa" w:w="3838"/>
+            <w:tcBorders>
+              <w:top w:val="single" w:color="D9D4F0" w:sz="4"/>
+              <w:left w:val="single" w:color="D9D4F0" w:sz="4"/>
+              <w:bottom w:val="single" w:color="D9D4F0" w:sz="4"/>
+              <w:right w:val="single" w:color="D9D4F0" w:sz="4"/>
+            </w:tcBorders>
+            <w:tcMar>
+              <w:top w:type="dxa" w:w="80"/>
+              <w:left w:type="dxa" w:w="120"/>
+              <w:bottom w:type="dxa" w:w="80"/>
+              <w:right w:type="dxa" w:w="120"/>
+            </w:tcMar>
+          </w:tcPr>
+          <w:p>
+            <w:r>
+              <w:rPr>
+                <w:b w:val="false"/>
+                <w:bCs w:val="false"/>
+                <w:sz w:val="20"/>
+                <w:szCs w:val="20"/>
+              </w:rPr>
+              <w:t xml:space="preserve">30 days of Mila free (1,200 credits) once all 3 are checked.</w:t>
+            </w:r>
+          </w:p>
+        </w:tc>
+        <w:tc>
+          <w:tcPr>
+            <w:tcW w:type="dxa" w:w="3838"/>
+            <w:tcBorders>
+              <w:top w:val="single" w:color="D9D4F0" w:sz="4"/>
+              <w:left w:val="single" w:color="D9D4F0" w:sz="4"/>
+              <w:bottom w:val="single" w:color="D9D4F0" w:sz="4"/>
+              <w:right w:val="single" w:color="D9D4F0" w:sz="4"/>
+            </w:tcBorders>
+            <w:tcMar>
+              <w:top w:type="dxa" w:w="80"/>
+              <w:left w:type="dxa" w:w="120"/>
+              <w:bottom w:type="dxa" w:w="80"/>
+              <w:right w:type="dxa" w:w="120"/>
+            </w:tcMar>
+          </w:tcPr>
+          <w:p>
+            <w:r>
+              <w:rPr>
+                <w:b w:val="false"/>
+                <w:bCs w:val="false"/>
+                <w:sz w:val="20"/>
+                <w:szCs w:val="20"/>
+              </w:rPr>
+              <w:t xml:space="preserve">Mila free every month they hit their videos, a personal sign-up link, and a commission.</w:t>
+            </w:r>
+          </w:p>
+        </w:tc>
+      </w:tr>
+      <w:tr>
+        <w:tc>
+          <w:tcPr>
+            <w:tcW w:type="dxa" w:w="1685"/>
+            <w:tcBorders>
+              <w:top w:val="single" w:color="D9D4F0" w:sz="4"/>
+              <w:left w:val="single" w:color="D9D4F0" w:sz="4"/>
+              <w:bottom w:val="single" w:color="D9D4F0" w:sz="4"/>
+              <w:right w:val="single" w:color="D9D4F0" w:sz="4"/>
+            </w:tcBorders>
+            <w:tcMar>
+              <w:top w:type="dxa" w:w="80"/>
+              <w:left w:type="dxa" w:w="120"/>
+              <w:bottom w:type="dxa" w:w="80"/>
+              <w:right w:type="dxa" w:w="120"/>
+            </w:tcMar>
+          </w:tcPr>
+          <w:p>
+            <w:r>
+              <w:rPr>
+                <w:b w:val="false"/>
+                <w:bCs w:val="false"/>
+                <w:sz w:val="20"/>
+                <w:szCs w:val="20"/>
+              </w:rPr>
+              <w:t xml:space="preserve">Commission</w:t>
+            </w:r>
+          </w:p>
+        </w:tc>
+        <w:tc>
+          <w:tcPr>
+            <w:tcW w:type="dxa" w:w="3838"/>
+            <w:tcBorders>
+              <w:top w:val="single" w:color="D9D4F0" w:sz="4"/>
+              <w:left w:val="single" w:color="D9D4F0" w:sz="4"/>
+              <w:bottom w:val="single" w:color="D9D4F0" w:sz="4"/>
+              <w:right w:val="single" w:color="D9D4F0" w:sz="4"/>
+            </w:tcBorders>
+            <w:tcMar>
+              <w:top w:type="dxa" w:w="80"/>
+              <w:left w:type="dxa" w:w="120"/>
+              <w:bottom w:type="dxa" w:w="80"/>
+              <w:right w:type="dxa" w:w="120"/>
+            </w:tcMar>
+          </w:tcPr>
+          <w:p>
+            <w:r>
+              <w:rPr>
+                <w:b w:val="false"/>
+                <w:bCs w:val="false"/>
+                <w:sz w:val="20"/>
+                <w:szCs w:val="20"/>
+              </w:rPr>
+              <w:t xml:space="preserve">None.</w:t>
+            </w:r>
+          </w:p>
+        </w:tc>
+        <w:tc>
+          <w:tcPr>
+            <w:tcW w:type="dxa" w:w="3838"/>
+            <w:tcBorders>
+              <w:top w:val="single" w:color="D9D4F0" w:sz="4"/>
+              <w:left w:val="single" w:color="D9D4F0" w:sz="4"/>
+              <w:bottom w:val="single" w:color="D9D4F0" w:sz="4"/>
+              <w:right w:val="single" w:color="D9D4F0" w:sz="4"/>
+            </w:tcBorders>
+            <w:tcMar>
+              <w:top w:type="dxa" w:w="80"/>
+              <w:left w:type="dxa" w:w="120"/>
+              <w:bottom w:type="dxa" w:w="80"/>
+              <w:right w:type="dxa" w:w="120"/>
+            </w:tcMar>
+          </w:tcPr>
+          <w:p>
+            <w:r>
+              <w:rPr>
+                <w:b w:val="false"/>
+                <w:bCs w:val="false"/>
+                <w:sz w:val="20"/>
+                <w:szCs w:val="20"/>
+              </w:rPr>
+              <w:t xml:space="preserve">20% of every payment from people who sign up with their code, for 12 months per person (editable per partner).</w:t>
+            </w:r>
+          </w:p>
+        </w:tc>
+      </w:tr>
+      <w:tr>
+        <w:tc>
+          <w:tcPr>
+            <w:tcW w:type="dxa" w:w="1685"/>
+            <w:tcBorders>
+              <w:top w:val="single" w:color="D9D4F0" w:sz="4"/>
+              <w:left w:val="single" w:color="D9D4F0" w:sz="4"/>
+              <w:bottom w:val="single" w:color="D9D4F0" w:sz="4"/>
+              <w:right w:val="single" w:color="D9D4F0" w:sz="4"/>
+            </w:tcBorders>
+            <w:tcMar>
+              <w:top w:type="dxa" w:w="80"/>
+              <w:left w:type="dxa" w:w="120"/>
+              <w:bottom w:type="dxa" w:w="80"/>
+              <w:right w:type="dxa" w:w="120"/>
+            </w:tcMar>
+          </w:tcPr>
+          <w:p>
+            <w:r>
+              <w:rPr>
+                <w:b w:val="false"/>
+                <w:bCs w:val="false"/>
+                <w:sz w:val="20"/>
+                <w:szCs w:val="20"/>
+              </w:rPr>
+              <w:t xml:space="preserve">If they stop</w:t>
+            </w:r>
+          </w:p>
+        </w:tc>
+        <w:tc>
+          <w:tcPr>
+            <w:tcW w:type="dxa" w:w="3838"/>
+            <w:tcBorders>
+              <w:top w:val="single" w:color="D9D4F0" w:sz="4"/>
+              <w:left w:val="single" w:color="D9D4F0" w:sz="4"/>
+              <w:bottom w:val="single" w:color="D9D4F0" w:sz="4"/>
+              <w:right w:val="single" w:color="D9D4F0" w:sz="4"/>
+            </w:tcBorders>
+            <w:tcMar>
+              <w:top w:type="dxa" w:w="80"/>
+              <w:left w:type="dxa" w:w="120"/>
+              <w:bottom w:type="dxa" w:w="80"/>
+              <w:right w:type="dxa" w:w="120"/>
+            </w:tcMar>
+          </w:tcPr>
+          <w:p>
+            <w:r>
+              <w:rPr>
+                <w:b w:val="false"/>
+                <w:bCs w:val="false"/>
+                <w:sz w:val="20"/>
+                <w:szCs w:val="20"/>
+              </w:rPr>
+              <w:t xml:space="preserve">Access ends when the window closes.</w:t>
+            </w:r>
+          </w:p>
+        </w:tc>
+        <w:tc>
+          <w:tcPr>
+            <w:tcW w:type="dxa" w:w="3838"/>
+            <w:tcBorders>
+              <w:top w:val="single" w:color="D9D4F0" w:sz="4"/>
+              <w:left w:val="single" w:color="D9D4F0" w:sz="4"/>
+              <w:bottom w:val="single" w:color="D9D4F0" w:sz="4"/>
+              <w:right w:val="single" w:color="D9D4F0" w:sz="4"/>
+            </w:tcBorders>
+            <w:tcMar>
+              <w:top w:type="dxa" w:w="80"/>
+              <w:left w:type="dxa" w:w="120"/>
+              <w:bottom w:type="dxa" w:w="80"/>
+              <w:right w:type="dxa" w:w="120"/>
+            </w:tcMar>
+          </w:tcPr>
+          <w:p>
+            <w:r>
+              <w:rPr>
+                <w:b w:val="false"/>
+                <w:bCs w:val="false"/>
+                <w:sz w:val="20"/>
+                <w:szCs w:val="20"/>
+              </w:rPr>
+              <w:t xml:space="preserve">On the 1st, a partner who missed last month is paused: free Mila stops, referrals and commission stay.</w:t>
+            </w:r>
+          </w:p>
+        </w:tc>
+      </w:tr>
+      <w:tr>
+        <w:tc>
+          <w:tcPr>
+            <w:tcW w:type="dxa" w:w="1685"/>
+            <w:tcBorders>
+              <w:top w:val="single" w:color="D9D4F0" w:sz="4"/>
+              <w:left w:val="single" w:color="D9D4F0" w:sz="4"/>
+              <w:bottom w:val="single" w:color="D9D4F0" w:sz="4"/>
+              <w:right w:val="single" w:color="D9D4F0" w:sz="4"/>
+            </w:tcBorders>
+            <w:tcMar>
+              <w:top w:type="dxa" w:w="80"/>
+              <w:left w:type="dxa" w:w="120"/>
+              <w:bottom w:type="dxa" w:w="80"/>
+              <w:right w:type="dxa" w:w="120"/>
+            </w:tcMar>
+          </w:tcPr>
+          <w:p>
+            <w:r>
+              <w:rPr>
+                <w:b w:val="false"/>
+                <w:bCs w:val="false"/>
+                <w:sz w:val="20"/>
+                <w:szCs w:val="20"/>
+              </w:rPr>
+              <w:t xml:space="preserve">Who decides</w:t>
+            </w:r>
+          </w:p>
+        </w:tc>
+        <w:tc>
+          <w:tcPr>
+            <w:tcW w:type="dxa" w:w="3838"/>
+            <w:tcBorders>
+              <w:top w:val="single" w:color="D9D4F0" w:sz="4"/>
+              <w:left w:val="single" w:color="D9D4F0" w:sz="4"/>
+              <w:bottom w:val="single" w:color="D9D4F0" w:sz="4"/>
+              <w:right w:val="single" w:color="D9D4F0" w:sz="4"/>
+            </w:tcBorders>
+            <w:tcMar>
+              <w:top w:type="dxa" w:w="80"/>
+              <w:left w:type="dxa" w:w="120"/>
+              <w:bottom w:type="dxa" w:w="80"/>
+              <w:right w:type="dxa" w:w="120"/>
+            </w:tcMar>
+          </w:tcPr>
+          <w:p>
+            <w:r>
+              <w:rPr>
+                <w:b w:val="false"/>
+                <w:bCs w:val="false"/>
+                <w:sz w:val="20"/>
+                <w:szCs w:val="20"/>
+              </w:rPr>
+              <w:t xml:space="preserve">Sarah grants access and checks videos. Ryan gives the free month.</w:t>
+            </w:r>
+          </w:p>
+        </w:tc>
+        <w:tc>
+          <w:tcPr>
+            <w:tcW w:type="dxa" w:w="3838"/>
+            <w:tcBorders>
+              <w:top w:val="single" w:color="D9D4F0" w:sz="4"/>
+              <w:left w:val="single" w:color="D9D4F0" w:sz="4"/>
+              <w:bottom w:val="single" w:color="D9D4F0" w:sz="4"/>
+              <w:right w:val="single" w:color="D9D4F0" w:sz="4"/>
+            </w:tcBorders>
+            <w:tcMar>
+              <w:top w:type="dxa" w:w="80"/>
+              <w:left w:type="dxa" w:w="120"/>
+              <w:bottom w:type="dxa" w:w="80"/>
+              <w:right w:type="dxa" w:w="120"/>
+            </w:tcMar>
+          </w:tcPr>
+          <w:p>
+            <w:r>
+              <w:rPr>
+                <w:b w:val="false"/>
+                <w:bCs w:val="false"/>
+                <w:sz w:val="20"/>
+                <w:szCs w:val="20"/>
+              </w:rPr>
+              <w:t xml:space="preserve">Ryan promotes, sets terms and records payouts.</w:t>
+            </w:r>
+          </w:p>
+        </w:tc>
+      </w:tr>
+    </w:tbl>
+    <w:p>
+      <w:pPr>
+        <w:pStyle w:val="Heading2"/>
+        <w:spacing w:after="100" w:before="240"/>
+      </w:pPr>
+      <w:r>
+        <w:rPr>
+          <w:b/>
+          <w:bCs/>
+          <w:color w:val="1B1830"/>
+          <w:sz w:val="26"/>
+          <w:szCs w:val="26"/>
+        </w:rPr>
+        <w:t xml:space="preserve">Who does what</w:t>
+      </w:r>
+    </w:p>
+    <w:tbl>
+      <w:tblPr>
+        <w:tblW w:type="dxa" w:w="9360"/>
+        <w:tblBorders>
+          <w:top w:val="single" w:color="auto" w:sz="4"/>
+          <w:left w:val="single" w:color="auto" w:sz="4"/>
+          <w:bottom w:val="single" w:color="auto" w:sz="4"/>
+          <w:right w:val="single" w:color="auto" w:sz="4"/>
+          <w:insideH w:val="single" w:color="auto" w:sz="4"/>
+          <w:insideV w:val="single" w:color="auto" w:sz="4"/>
+        </w:tblBorders>
+      </w:tblPr>
+      <w:tblGrid>
+        <w:gridCol w:w="4212"/>
+        <w:gridCol w:w="1872"/>
+        <w:gridCol w:w="1872"/>
+        <w:gridCol w:w="1404"/>
+      </w:tblGrid>
+      <w:tr>
+        <w:trPr>
+          <w:tblHeader/>
+        </w:trPr>
+        <w:tc>
+          <w:tcPr>
+            <w:tcW w:type="dxa" w:w="4212"/>
+            <w:tcBorders>
+              <w:top w:val="single" w:color="D9D4F0" w:sz="4"/>
+              <w:left w:val="single" w:color="D9D4F0" w:sz="4"/>
+              <w:bottom w:val="single" w:color="D9D4F0" w:sz="4"/>
+              <w:right w:val="single" w:color="D9D4F0" w:sz="4"/>
+            </w:tcBorders>
+            <w:shd w:fill="EDE9FE" w:color="auto" w:val="clear"/>
+            <w:tcMar>
+              <w:top w:type="dxa" w:w="80"/>
+              <w:left w:type="dxa" w:w="120"/>
+              <w:bottom w:type="dxa" w:w="80"/>
+              <w:right w:type="dxa" w:w="120"/>
+            </w:tcMar>
+          </w:tcPr>
+          <w:p>
+            <w:r>
+              <w:rPr>
+                <w:b/>
+                <w:bCs/>
+                <w:sz w:val="20"/>
+                <w:szCs w:val="20"/>
+              </w:rPr>
+              <w:t xml:space="preserve">Task</w:t>
+            </w:r>
+          </w:p>
+        </w:tc>
+        <w:tc>
+          <w:tcPr>
+            <w:tcW w:type="dxa" w:w="1872"/>
+            <w:tcBorders>
+              <w:top w:val="single" w:color="D9D4F0" w:sz="4"/>
+              <w:left w:val="single" w:color="D9D4F0" w:sz="4"/>
+              <w:bottom w:val="single" w:color="D9D4F0" w:sz="4"/>
+              <w:right w:val="single" w:color="D9D4F0" w:sz="4"/>
+            </w:tcBorders>
+            <w:shd w:fill="EDE9FE" w:color="auto" w:val="clear"/>
+            <w:tcMar>
+              <w:top w:type="dxa" w:w="80"/>
+              <w:left w:type="dxa" w:w="120"/>
+              <w:bottom w:type="dxa" w:w="80"/>
+              <w:right w:type="dxa" w:w="120"/>
+            </w:tcMar>
+          </w:tcPr>
+          <w:p>
+            <w:r>
+              <w:rPr>
+                <w:b/>
+                <w:bCs/>
+                <w:sz w:val="20"/>
+                <w:szCs w:val="20"/>
+              </w:rPr>
+              <w:t xml:space="preserve">Sarah</w:t>
+            </w:r>
+          </w:p>
+        </w:tc>
+        <w:tc>
+          <w:tcPr>
+            <w:tcW w:type="dxa" w:w="1872"/>
+            <w:tcBorders>
+              <w:top w:val="single" w:color="D9D4F0" w:sz="4"/>
+              <w:left w:val="single" w:color="D9D4F0" w:sz="4"/>
+              <w:bottom w:val="single" w:color="D9D4F0" w:sz="4"/>
+              <w:right w:val="single" w:color="D9D4F0" w:sz="4"/>
+            </w:tcBorders>
+            <w:shd w:fill="EDE9FE" w:color="auto" w:val="clear"/>
+            <w:tcMar>
+              <w:top w:type="dxa" w:w="80"/>
+              <w:left w:type="dxa" w:w="120"/>
+              <w:bottom w:type="dxa" w:w="80"/>
+              <w:right w:type="dxa" w:w="120"/>
+            </w:tcMar>
+          </w:tcPr>
+          <w:p>
+            <w:r>
+              <w:rPr>
+                <w:b/>
+                <w:bCs/>
+                <w:sz w:val="20"/>
+                <w:szCs w:val="20"/>
+              </w:rPr>
+              <w:t xml:space="preserve">Ryan</w:t>
+            </w:r>
+          </w:p>
+        </w:tc>
+        <w:tc>
+          <w:tcPr>
+            <w:tcW w:type="dxa" w:w="1404"/>
+            <w:tcBorders>
+              <w:top w:val="single" w:color="D9D4F0" w:sz="4"/>
+              <w:left w:val="single" w:color="D9D4F0" w:sz="4"/>
+              <w:bottom w:val="single" w:color="D9D4F0" w:sz="4"/>
+              <w:right w:val="single" w:color="D9D4F0" w:sz="4"/>
+            </w:tcBorders>
+            <w:shd w:fill="EDE9FE" w:color="auto" w:val="clear"/>
+            <w:tcMar>
+              <w:top w:type="dxa" w:w="80"/>
+              <w:left w:type="dxa" w:w="120"/>
+              <w:bottom w:type="dxa" w:w="80"/>
+              <w:right w:type="dxa" w:w="120"/>
+            </w:tcMar>
+          </w:tcPr>
+          <w:p>
+            <w:r>
+              <w:rPr>
+                <w:b/>
+                <w:bCs/>
+                <w:sz w:val="20"/>
+                <w:szCs w:val="20"/>
+              </w:rPr>
+              <w:t xml:space="preserve">Automatic</w:t>
+            </w:r>
+          </w:p>
+        </w:tc>
+      </w:tr>
+      <w:tr>
+        <w:tc>
+          <w:tcPr>
+            <w:tcW w:type="dxa" w:w="4212"/>
+            <w:tcBorders>
+              <w:top w:val="single" w:color="D9D4F0" w:sz="4"/>
+              <w:left w:val="single" w:color="D9D4F0" w:sz="4"/>
+              <w:bottom w:val="single" w:color="D9D4F0" w:sz="4"/>
+              <w:right w:val="single" w:color="D9D4F0" w:sz="4"/>
+            </w:tcBorders>
+            <w:tcMar>
+              <w:top w:type="dxa" w:w="80"/>
+              <w:left w:type="dxa" w:w="120"/>
+              <w:bottom w:type="dxa" w:w="80"/>
+              <w:right w:type="dxa" w:w="120"/>
+            </w:tcMar>
+          </w:tcPr>
+          <w:p>
+            <w:r>
+              <w:rPr>
+                <w:b w:val="false"/>
+                <w:bCs w:val="false"/>
+                <w:sz w:val="20"/>
+                <w:szCs w:val="20"/>
+              </w:rPr>
+              <w:t xml:space="preserve">Find creators and message them</w:t>
+            </w:r>
+          </w:p>
+        </w:tc>
+        <w:tc>
+          <w:tcPr>
+            <w:tcW w:type="dxa" w:w="1872"/>
+            <w:tcBorders>
+              <w:top w:val="single" w:color="D9D4F0" w:sz="4"/>
+              <w:left w:val="single" w:color="D9D4F0" w:sz="4"/>
+              <w:bottom w:val="single" w:color="D9D4F0" w:sz="4"/>
+              <w:right w:val="single" w:color="D9D4F0" w:sz="4"/>
+            </w:tcBorders>
+            <w:tcMar>
+              <w:top w:type="dxa" w:w="80"/>
+              <w:left w:type="dxa" w:w="120"/>
+              <w:bottom w:type="dxa" w:w="80"/>
+              <w:right w:type="dxa" w:w="120"/>
+            </w:tcMar>
+          </w:tcPr>
+          <w:p>
+            <w:r>
+              <w:rPr>
+                <w:b w:val="false"/>
+                <w:bCs w:val="false"/>
+                <w:sz w:val="20"/>
+                <w:szCs w:val="20"/>
+              </w:rPr>
+              <w:t xml:space="preserve">Yes</w:t>
+            </w:r>
+          </w:p>
+        </w:tc>
+        <w:tc>
+          <w:tcPr>
+            <w:tcW w:type="dxa" w:w="1872"/>
+            <w:tcBorders>
+              <w:top w:val="single" w:color="D9D4F0" w:sz="4"/>
+              <w:left w:val="single" w:color="D9D4F0" w:sz="4"/>
+              <w:bottom w:val="single" w:color="D9D4F0" w:sz="4"/>
+              <w:right w:val="single" w:color="D9D4F0" w:sz="4"/>
+            </w:tcBorders>
+            <w:tcMar>
+              <w:top w:type="dxa" w:w="80"/>
+              <w:left w:type="dxa" w:w="120"/>
+              <w:bottom w:type="dxa" w:w="80"/>
+              <w:right w:type="dxa" w:w="120"/>
+            </w:tcMar>
+          </w:tcPr>
+          <w:p>
+            <w:r>
+              <w:rPr>
+                <w:b w:val="false"/>
+                <w:bCs w:val="false"/>
+                <w:sz w:val="20"/>
+                <w:szCs w:val="20"/>
+              </w:rPr>
+              <w:t xml:space="preserve"/>
+            </w:r>
+          </w:p>
+        </w:tc>
+        <w:tc>
+          <w:tcPr>
+            <w:tcW w:type="dxa" w:w="1404"/>
+            <w:tcBorders>
+              <w:top w:val="single" w:color="D9D4F0" w:sz="4"/>
+              <w:left w:val="single" w:color="D9D4F0" w:sz="4"/>
+              <w:bottom w:val="single" w:color="D9D4F0" w:sz="4"/>
+              <w:right w:val="single" w:color="D9D4F0" w:sz="4"/>
+            </w:tcBorders>
+            <w:tcMar>
+              <w:top w:type="dxa" w:w="80"/>
+              <w:left w:type="dxa" w:w="120"/>
+              <w:bottom w:type="dxa" w:w="80"/>
+              <w:right w:type="dxa" w:w="120"/>
+            </w:tcMar>
+          </w:tcPr>
+          <w:p>
+            <w:r>
+              <w:rPr>
+                <w:b w:val="false"/>
+                <w:bCs w:val="false"/>
+                <w:sz w:val="20"/>
+                <w:szCs w:val="20"/>
+              </w:rPr>
+              <w:t xml:space="preserve"/>
+            </w:r>
+          </w:p>
+        </w:tc>
+      </w:tr>
+      <w:tr>
+        <w:tc>
+          <w:tcPr>
+            <w:tcW w:type="dxa" w:w="4212"/>
+            <w:tcBorders>
+              <w:top w:val="single" w:color="D9D4F0" w:sz="4"/>
+              <w:left w:val="single" w:color="D9D4F0" w:sz="4"/>
+              <w:bottom w:val="single" w:color="D9D4F0" w:sz="4"/>
+              <w:right w:val="single" w:color="D9D4F0" w:sz="4"/>
+            </w:tcBorders>
+            <w:tcMar>
+              <w:top w:type="dxa" w:w="80"/>
+              <w:left w:type="dxa" w:w="120"/>
+              <w:bottom w:type="dxa" w:w="80"/>
+              <w:right w:type="dxa" w:w="120"/>
+            </w:tcMar>
+          </w:tcPr>
+          <w:p>
+            <w:r>
+              <w:rPr>
+                <w:b w:val="false"/>
+                <w:bCs w:val="false"/>
+                <w:sz w:val="20"/>
+                <w:szCs w:val="20"/>
+              </w:rPr>
+              <w:t xml:space="preserve">Add them, grant access, resend invites</w:t>
+            </w:r>
+          </w:p>
+        </w:tc>
+        <w:tc>
+          <w:tcPr>
+            <w:tcW w:type="dxa" w:w="1872"/>
+            <w:tcBorders>
+              <w:top w:val="single" w:color="D9D4F0" w:sz="4"/>
+              <w:left w:val="single" w:color="D9D4F0" w:sz="4"/>
+              <w:bottom w:val="single" w:color="D9D4F0" w:sz="4"/>
+              <w:right w:val="single" w:color="D9D4F0" w:sz="4"/>
+            </w:tcBorders>
+            <w:tcMar>
+              <w:top w:type="dxa" w:w="80"/>
+              <w:left w:type="dxa" w:w="120"/>
+              <w:bottom w:type="dxa" w:w="80"/>
+              <w:right w:type="dxa" w:w="120"/>
+            </w:tcMar>
+          </w:tcPr>
+          <w:p>
+            <w:r>
+              <w:rPr>
+                <w:b w:val="false"/>
+                <w:bCs w:val="false"/>
+                <w:sz w:val="20"/>
+                <w:szCs w:val="20"/>
+              </w:rPr>
+              <w:t xml:space="preserve">Yes (max 15 at once)</w:t>
+            </w:r>
+          </w:p>
+        </w:tc>
+        <w:tc>
+          <w:tcPr>
+            <w:tcW w:type="dxa" w:w="1872"/>
+            <w:tcBorders>
+              <w:top w:val="single" w:color="D9D4F0" w:sz="4"/>
+              <w:left w:val="single" w:color="D9D4F0" w:sz="4"/>
+              <w:bottom w:val="single" w:color="D9D4F0" w:sz="4"/>
+              <w:right w:val="single" w:color="D9D4F0" w:sz="4"/>
+            </w:tcBorders>
+            <w:tcMar>
+              <w:top w:type="dxa" w:w="80"/>
+              <w:left w:type="dxa" w:w="120"/>
+              <w:bottom w:type="dxa" w:w="80"/>
+              <w:right w:type="dxa" w:w="120"/>
+            </w:tcMar>
+          </w:tcPr>
+          <w:p>
+            <w:r>
+              <w:rPr>
+                <w:b w:val="false"/>
+                <w:bCs w:val="false"/>
+                <w:sz w:val="20"/>
+                <w:szCs w:val="20"/>
+              </w:rPr>
+              <w:t xml:space="preserve">Yes</w:t>
+            </w:r>
+          </w:p>
+        </w:tc>
+        <w:tc>
+          <w:tcPr>
+            <w:tcW w:type="dxa" w:w="1404"/>
+            <w:tcBorders>
+              <w:top w:val="single" w:color="D9D4F0" w:sz="4"/>
+              <w:left w:val="single" w:color="D9D4F0" w:sz="4"/>
+              <w:bottom w:val="single" w:color="D9D4F0" w:sz="4"/>
+              <w:right w:val="single" w:color="D9D4F0" w:sz="4"/>
+            </w:tcBorders>
+            <w:tcMar>
+              <w:top w:type="dxa" w:w="80"/>
+              <w:left w:type="dxa" w:w="120"/>
+              <w:bottom w:type="dxa" w:w="80"/>
+              <w:right w:type="dxa" w:w="120"/>
+            </w:tcMar>
+          </w:tcPr>
+          <w:p>
+            <w:r>
+              <w:rPr>
+                <w:b w:val="false"/>
+                <w:bCs w:val="false"/>
+                <w:sz w:val="20"/>
+                <w:szCs w:val="20"/>
+              </w:rPr>
+              <w:t xml:space="preserve"/>
+            </w:r>
+          </w:p>
+        </w:tc>
+      </w:tr>
+      <w:tr>
+        <w:tc>
+          <w:tcPr>
+            <w:tcW w:type="dxa" w:w="4212"/>
+            <w:tcBorders>
+              <w:top w:val="single" w:color="D9D4F0" w:sz="4"/>
+              <w:left w:val="single" w:color="D9D4F0" w:sz="4"/>
+              <w:bottom w:val="single" w:color="D9D4F0" w:sz="4"/>
+              <w:right w:val="single" w:color="D9D4F0" w:sz="4"/>
+            </w:tcBorders>
+            <w:tcMar>
+              <w:top w:type="dxa" w:w="80"/>
+              <w:left w:type="dxa" w:w="120"/>
+              <w:bottom w:type="dxa" w:w="80"/>
+              <w:right w:type="dxa" w:w="120"/>
+            </w:tcMar>
+          </w:tcPr>
+          <w:p>
+            <w:r>
+              <w:rPr>
+                <w:b w:val="false"/>
+                <w:bCs w:val="false"/>
+                <w:sz w:val="20"/>
+                <w:szCs w:val="20"/>
+              </w:rPr>
+              <w:t xml:space="preserve">Check each video (four boxes)</w:t>
+            </w:r>
+          </w:p>
+        </w:tc>
+        <w:tc>
+          <w:tcPr>
+            <w:tcW w:type="dxa" w:w="1872"/>
+            <w:tcBorders>
+              <w:top w:val="single" w:color="D9D4F0" w:sz="4"/>
+              <w:left w:val="single" w:color="D9D4F0" w:sz="4"/>
+              <w:bottom w:val="single" w:color="D9D4F0" w:sz="4"/>
+              <w:right w:val="single" w:color="D9D4F0" w:sz="4"/>
+            </w:tcBorders>
+            <w:tcMar>
+              <w:top w:type="dxa" w:w="80"/>
+              <w:left w:type="dxa" w:w="120"/>
+              <w:bottom w:type="dxa" w:w="80"/>
+              <w:right w:type="dxa" w:w="120"/>
+            </w:tcMar>
+          </w:tcPr>
+          <w:p>
+            <w:r>
+              <w:rPr>
+                <w:b w:val="false"/>
+                <w:bCs w:val="false"/>
+                <w:sz w:val="20"/>
+                <w:szCs w:val="20"/>
+              </w:rPr>
+              <w:t xml:space="preserve">Yes</w:t>
+            </w:r>
+          </w:p>
+        </w:tc>
+        <w:tc>
+          <w:tcPr>
+            <w:tcW w:type="dxa" w:w="1872"/>
+            <w:tcBorders>
+              <w:top w:val="single" w:color="D9D4F0" w:sz="4"/>
+              <w:left w:val="single" w:color="D9D4F0" w:sz="4"/>
+              <w:bottom w:val="single" w:color="D9D4F0" w:sz="4"/>
+              <w:right w:val="single" w:color="D9D4F0" w:sz="4"/>
+            </w:tcBorders>
+            <w:tcMar>
+              <w:top w:type="dxa" w:w="80"/>
+              <w:left w:type="dxa" w:w="120"/>
+              <w:bottom w:type="dxa" w:w="80"/>
+              <w:right w:type="dxa" w:w="120"/>
+            </w:tcMar>
+          </w:tcPr>
+          <w:p>
+            <w:r>
+              <w:rPr>
+                <w:b w:val="false"/>
+                <w:bCs w:val="false"/>
+                <w:sz w:val="20"/>
+                <w:szCs w:val="20"/>
+              </w:rPr>
+              <w:t xml:space="preserve">Yes</w:t>
+            </w:r>
+          </w:p>
+        </w:tc>
+        <w:tc>
+          <w:tcPr>
+            <w:tcW w:type="dxa" w:w="1404"/>
+            <w:tcBorders>
+              <w:top w:val="single" w:color="D9D4F0" w:sz="4"/>
+              <w:left w:val="single" w:color="D9D4F0" w:sz="4"/>
+              <w:bottom w:val="single" w:color="D9D4F0" w:sz="4"/>
+              <w:right w:val="single" w:color="D9D4F0" w:sz="4"/>
+            </w:tcBorders>
+            <w:tcMar>
+              <w:top w:type="dxa" w:w="80"/>
+              <w:left w:type="dxa" w:w="120"/>
+              <w:bottom w:type="dxa" w:w="80"/>
+              <w:right w:type="dxa" w:w="120"/>
+            </w:tcMar>
+          </w:tcPr>
+          <w:p>
+            <w:r>
+              <w:rPr>
+                <w:b w:val="false"/>
+                <w:bCs w:val="false"/>
+                <w:sz w:val="20"/>
+                <w:szCs w:val="20"/>
+              </w:rPr>
+              <w:t xml:space="preserve"/>
+            </w:r>
+          </w:p>
+        </w:tc>
+      </w:tr>
+      <w:tr>
+        <w:tc>
+          <w:tcPr>
+            <w:tcW w:type="dxa" w:w="4212"/>
+            <w:tcBorders>
+              <w:top w:val="single" w:color="D9D4F0" w:sz="4"/>
+              <w:left w:val="single" w:color="D9D4F0" w:sz="4"/>
+              <w:bottom w:val="single" w:color="D9D4F0" w:sz="4"/>
+              <w:right w:val="single" w:color="D9D4F0" w:sz="4"/>
+            </w:tcBorders>
+            <w:tcMar>
+              <w:top w:type="dxa" w:w="80"/>
+              <w:left w:type="dxa" w:w="120"/>
+              <w:bottom w:type="dxa" w:w="80"/>
+              <w:right w:type="dxa" w:w="120"/>
+            </w:tcMar>
+          </w:tcPr>
+          <w:p>
+            <w:r>
+              <w:rPr>
+                <w:b w:val="false"/>
+                <w:bCs w:val="false"/>
+                <w:sz w:val="20"/>
+                <w:szCs w:val="20"/>
+              </w:rPr>
+              <w:t xml:space="preserve">Reminders and nudges</w:t>
+            </w:r>
+          </w:p>
+        </w:tc>
+        <w:tc>
+          <w:tcPr>
+            <w:tcW w:type="dxa" w:w="1872"/>
+            <w:tcBorders>
+              <w:top w:val="single" w:color="D9D4F0" w:sz="4"/>
+              <w:left w:val="single" w:color="D9D4F0" w:sz="4"/>
+              <w:bottom w:val="single" w:color="D9D4F0" w:sz="4"/>
+              <w:right w:val="single" w:color="D9D4F0" w:sz="4"/>
+            </w:tcBorders>
+            <w:tcMar>
+              <w:top w:type="dxa" w:w="80"/>
+              <w:left w:type="dxa" w:w="120"/>
+              <w:bottom w:type="dxa" w:w="80"/>
+              <w:right w:type="dxa" w:w="120"/>
+            </w:tcMar>
+          </w:tcPr>
+          <w:p>
+            <w:r>
+              <w:rPr>
+                <w:b w:val="false"/>
+                <w:bCs w:val="false"/>
+                <w:sz w:val="20"/>
+                <w:szCs w:val="20"/>
+              </w:rPr>
+              <w:t xml:space="preserve">Can send</w:t>
+            </w:r>
+          </w:p>
+        </w:tc>
+        <w:tc>
+          <w:tcPr>
+            <w:tcW w:type="dxa" w:w="1872"/>
+            <w:tcBorders>
+              <w:top w:val="single" w:color="D9D4F0" w:sz="4"/>
+              <w:left w:val="single" w:color="D9D4F0" w:sz="4"/>
+              <w:bottom w:val="single" w:color="D9D4F0" w:sz="4"/>
+              <w:right w:val="single" w:color="D9D4F0" w:sz="4"/>
+            </w:tcBorders>
+            <w:tcMar>
+              <w:top w:type="dxa" w:w="80"/>
+              <w:left w:type="dxa" w:w="120"/>
+              <w:bottom w:type="dxa" w:w="80"/>
+              <w:right w:type="dxa" w:w="120"/>
+            </w:tcMar>
+          </w:tcPr>
+          <w:p>
+            <w:r>
+              <w:rPr>
+                <w:b w:val="false"/>
+                <w:bCs w:val="false"/>
+                <w:sz w:val="20"/>
+                <w:szCs w:val="20"/>
+              </w:rPr>
+              <w:t xml:space="preserve">Can send</w:t>
+            </w:r>
+          </w:p>
+        </w:tc>
+        <w:tc>
+          <w:tcPr>
+            <w:tcW w:type="dxa" w:w="1404"/>
+            <w:tcBorders>
+              <w:top w:val="single" w:color="D9D4F0" w:sz="4"/>
+              <w:left w:val="single" w:color="D9D4F0" w:sz="4"/>
+              <w:bottom w:val="single" w:color="D9D4F0" w:sz="4"/>
+              <w:right w:val="single" w:color="D9D4F0" w:sz="4"/>
+            </w:tcBorders>
+            <w:tcMar>
+              <w:top w:type="dxa" w:w="80"/>
+              <w:left w:type="dxa" w:w="120"/>
+              <w:bottom w:type="dxa" w:w="80"/>
+              <w:right w:type="dxa" w:w="120"/>
+            </w:tcMar>
+          </w:tcPr>
+          <w:p>
+            <w:r>
+              <w:rPr>
+                <w:b w:val="false"/>
+                <w:bCs w:val="false"/>
+                <w:sz w:val="20"/>
+                <w:szCs w:val="20"/>
+              </w:rPr>
+              <w:t xml:space="preserve">Yes, daily</w:t>
+            </w:r>
+          </w:p>
+        </w:tc>
+      </w:tr>
+      <w:tr>
+        <w:tc>
+          <w:tcPr>
+            <w:tcW w:type="dxa" w:w="4212"/>
+            <w:tcBorders>
+              <w:top w:val="single" w:color="D9D4F0" w:sz="4"/>
+              <w:left w:val="single" w:color="D9D4F0" w:sz="4"/>
+              <w:bottom w:val="single" w:color="D9D4F0" w:sz="4"/>
+              <w:right w:val="single" w:color="D9D4F0" w:sz="4"/>
+            </w:tcBorders>
+            <w:tcMar>
+              <w:top w:type="dxa" w:w="80"/>
+              <w:left w:type="dxa" w:w="120"/>
+              <w:bottom w:type="dxa" w:w="80"/>
+              <w:right w:type="dxa" w:w="120"/>
+            </w:tcMar>
+          </w:tcPr>
+          <w:p>
+            <w:r>
+              <w:rPr>
+                <w:b w:val="false"/>
+                <w:bCs w:val="false"/>
+                <w:sz w:val="20"/>
+                <w:szCs w:val="20"/>
+              </w:rPr>
+              <w:t xml:space="preserve">Give the free month</w:t>
+            </w:r>
+          </w:p>
+        </w:tc>
+        <w:tc>
+          <w:tcPr>
+            <w:tcW w:type="dxa" w:w="1872"/>
+            <w:tcBorders>
+              <w:top w:val="single" w:color="D9D4F0" w:sz="4"/>
+              <w:left w:val="single" w:color="D9D4F0" w:sz="4"/>
+              <w:bottom w:val="single" w:color="D9D4F0" w:sz="4"/>
+              <w:right w:val="single" w:color="D9D4F0" w:sz="4"/>
+            </w:tcBorders>
+            <w:tcMar>
+              <w:top w:type="dxa" w:w="80"/>
+              <w:left w:type="dxa" w:w="120"/>
+              <w:bottom w:type="dxa" w:w="80"/>
+              <w:right w:type="dxa" w:w="120"/>
+            </w:tcMar>
+          </w:tcPr>
+          <w:p>
+            <w:r>
+              <w:rPr>
+                <w:b w:val="false"/>
+                <w:bCs w:val="false"/>
+                <w:sz w:val="20"/>
+                <w:szCs w:val="20"/>
+              </w:rPr>
+              <w:t xml:space="preserve"/>
+            </w:r>
+          </w:p>
+        </w:tc>
+        <w:tc>
+          <w:tcPr>
+            <w:tcW w:type="dxa" w:w="1872"/>
+            <w:tcBorders>
+              <w:top w:val="single" w:color="D9D4F0" w:sz="4"/>
+              <w:left w:val="single" w:color="D9D4F0" w:sz="4"/>
+              <w:bottom w:val="single" w:color="D9D4F0" w:sz="4"/>
+              <w:right w:val="single" w:color="D9D4F0" w:sz="4"/>
+            </w:tcBorders>
+            <w:tcMar>
+              <w:top w:type="dxa" w:w="80"/>
+              <w:left w:type="dxa" w:w="120"/>
+              <w:bottom w:type="dxa" w:w="80"/>
+              <w:right w:type="dxa" w:w="120"/>
+            </w:tcMar>
+          </w:tcPr>
+          <w:p>
+            <w:r>
+              <w:rPr>
+                <w:b w:val="false"/>
+                <w:bCs w:val="false"/>
+                <w:sz w:val="20"/>
+                <w:szCs w:val="20"/>
+              </w:rPr>
+              <w:t xml:space="preserve">Yes</w:t>
+            </w:r>
+          </w:p>
+        </w:tc>
+        <w:tc>
+          <w:tcPr>
+            <w:tcW w:type="dxa" w:w="1404"/>
+            <w:tcBorders>
+              <w:top w:val="single" w:color="D9D4F0" w:sz="4"/>
+              <w:left w:val="single" w:color="D9D4F0" w:sz="4"/>
+              <w:bottom w:val="single" w:color="D9D4F0" w:sz="4"/>
+              <w:right w:val="single" w:color="D9D4F0" w:sz="4"/>
+            </w:tcBorders>
+            <w:tcMar>
+              <w:top w:type="dxa" w:w="80"/>
+              <w:left w:type="dxa" w:w="120"/>
+              <w:bottom w:type="dxa" w:w="80"/>
+              <w:right w:type="dxa" w:w="120"/>
+            </w:tcMar>
+          </w:tcPr>
+          <w:p>
+            <w:r>
+              <w:rPr>
+                <w:b w:val="false"/>
+                <w:bCs w:val="false"/>
+                <w:sz w:val="20"/>
+                <w:szCs w:val="20"/>
+              </w:rPr>
+              <w:t xml:space="preserve"/>
+            </w:r>
+          </w:p>
+        </w:tc>
+      </w:tr>
+      <w:tr>
+        <w:tc>
+          <w:tcPr>
+            <w:tcW w:type="dxa" w:w="4212"/>
+            <w:tcBorders>
+              <w:top w:val="single" w:color="D9D4F0" w:sz="4"/>
+              <w:left w:val="single" w:color="D9D4F0" w:sz="4"/>
+              <w:bottom w:val="single" w:color="D9D4F0" w:sz="4"/>
+              <w:right w:val="single" w:color="D9D4F0" w:sz="4"/>
+            </w:tcBorders>
+            <w:tcMar>
+              <w:top w:type="dxa" w:w="80"/>
+              <w:left w:type="dxa" w:w="120"/>
+              <w:bottom w:type="dxa" w:w="80"/>
+              <w:right w:type="dxa" w:w="120"/>
+            </w:tcMar>
+          </w:tcPr>
+          <w:p>
+            <w:r>
+              <w:rPr>
+                <w:b w:val="false"/>
+                <w:bCs w:val="false"/>
+                <w:sz w:val="20"/>
+                <w:szCs w:val="20"/>
+              </w:rPr>
+              <w:t xml:space="preserve">Make a partner, change terms, pause</w:t>
+            </w:r>
+          </w:p>
+        </w:tc>
+        <w:tc>
+          <w:tcPr>
+            <w:tcW w:type="dxa" w:w="1872"/>
+            <w:tcBorders>
+              <w:top w:val="single" w:color="D9D4F0" w:sz="4"/>
+              <w:left w:val="single" w:color="D9D4F0" w:sz="4"/>
+              <w:bottom w:val="single" w:color="D9D4F0" w:sz="4"/>
+              <w:right w:val="single" w:color="D9D4F0" w:sz="4"/>
+            </w:tcBorders>
+            <w:tcMar>
+              <w:top w:type="dxa" w:w="80"/>
+              <w:left w:type="dxa" w:w="120"/>
+              <w:bottom w:type="dxa" w:w="80"/>
+              <w:right w:type="dxa" w:w="120"/>
+            </w:tcMar>
+          </w:tcPr>
+          <w:p>
+            <w:r>
+              <w:rPr>
+                <w:b w:val="false"/>
+                <w:bCs w:val="false"/>
+                <w:sz w:val="20"/>
+                <w:szCs w:val="20"/>
+              </w:rPr>
+              <w:t xml:space="preserve"/>
+            </w:r>
+          </w:p>
+        </w:tc>
+        <w:tc>
+          <w:tcPr>
+            <w:tcW w:type="dxa" w:w="1872"/>
+            <w:tcBorders>
+              <w:top w:val="single" w:color="D9D4F0" w:sz="4"/>
+              <w:left w:val="single" w:color="D9D4F0" w:sz="4"/>
+              <w:bottom w:val="single" w:color="D9D4F0" w:sz="4"/>
+              <w:right w:val="single" w:color="D9D4F0" w:sz="4"/>
+            </w:tcBorders>
+            <w:tcMar>
+              <w:top w:type="dxa" w:w="80"/>
+              <w:left w:type="dxa" w:w="120"/>
+              <w:bottom w:type="dxa" w:w="80"/>
+              <w:right w:type="dxa" w:w="120"/>
+            </w:tcMar>
+          </w:tcPr>
+          <w:p>
+            <w:r>
+              <w:rPr>
+                <w:b w:val="false"/>
+                <w:bCs w:val="false"/>
+                <w:sz w:val="20"/>
+                <w:szCs w:val="20"/>
+              </w:rPr>
+              <w:t xml:space="preserve">Yes</w:t>
+            </w:r>
+          </w:p>
+        </w:tc>
+        <w:tc>
+          <w:tcPr>
+            <w:tcW w:type="dxa" w:w="1404"/>
+            <w:tcBorders>
+              <w:top w:val="single" w:color="D9D4F0" w:sz="4"/>
+              <w:left w:val="single" w:color="D9D4F0" w:sz="4"/>
+              <w:bottom w:val="single" w:color="D9D4F0" w:sz="4"/>
+              <w:right w:val="single" w:color="D9D4F0" w:sz="4"/>
+            </w:tcBorders>
+            <w:tcMar>
+              <w:top w:type="dxa" w:w="80"/>
+              <w:left w:type="dxa" w:w="120"/>
+              <w:bottom w:type="dxa" w:w="80"/>
+              <w:right w:type="dxa" w:w="120"/>
+            </w:tcMar>
+          </w:tcPr>
+          <w:p>
+            <w:r>
+              <w:rPr>
+                <w:b w:val="false"/>
+                <w:bCs w:val="false"/>
+                <w:sz w:val="20"/>
+                <w:szCs w:val="20"/>
+              </w:rPr>
+              <w:t xml:space="preserve"/>
+            </w:r>
+          </w:p>
+        </w:tc>
+      </w:tr>
+      <w:tr>
+        <w:tc>
+          <w:tcPr>
+            <w:tcW w:type="dxa" w:w="4212"/>
+            <w:tcBorders>
+              <w:top w:val="single" w:color="D9D4F0" w:sz="4"/>
+              <w:left w:val="single" w:color="D9D4F0" w:sz="4"/>
+              <w:bottom w:val="single" w:color="D9D4F0" w:sz="4"/>
+              <w:right w:val="single" w:color="D9D4F0" w:sz="4"/>
+            </w:tcBorders>
+            <w:tcMar>
+              <w:top w:type="dxa" w:w="80"/>
+              <w:left w:type="dxa" w:w="120"/>
+              <w:bottom w:type="dxa" w:w="80"/>
+              <w:right w:type="dxa" w:w="120"/>
+            </w:tcMar>
+          </w:tcPr>
+          <w:p>
+            <w:r>
+              <w:rPr>
+                <w:b w:val="false"/>
+                <w:bCs w:val="false"/>
+                <w:sz w:val="20"/>
+                <w:szCs w:val="20"/>
+              </w:rPr>
+              <w:t xml:space="preserve">Record commission payouts</w:t>
+            </w:r>
+          </w:p>
+        </w:tc>
+        <w:tc>
+          <w:tcPr>
+            <w:tcW w:type="dxa" w:w="1872"/>
+            <w:tcBorders>
+              <w:top w:val="single" w:color="D9D4F0" w:sz="4"/>
+              <w:left w:val="single" w:color="D9D4F0" w:sz="4"/>
+              <w:bottom w:val="single" w:color="D9D4F0" w:sz="4"/>
+              <w:right w:val="single" w:color="D9D4F0" w:sz="4"/>
+            </w:tcBorders>
+            <w:tcMar>
+              <w:top w:type="dxa" w:w="80"/>
+              <w:left w:type="dxa" w:w="120"/>
+              <w:bottom w:type="dxa" w:w="80"/>
+              <w:right w:type="dxa" w:w="120"/>
+            </w:tcMar>
+          </w:tcPr>
+          <w:p>
+            <w:r>
+              <w:rPr>
+                <w:b w:val="false"/>
+                <w:bCs w:val="false"/>
+                <w:sz w:val="20"/>
+                <w:szCs w:val="20"/>
+              </w:rPr>
+              <w:t xml:space="preserve"/>
+            </w:r>
+          </w:p>
+        </w:tc>
+        <w:tc>
+          <w:tcPr>
+            <w:tcW w:type="dxa" w:w="1872"/>
+            <w:tcBorders>
+              <w:top w:val="single" w:color="D9D4F0" w:sz="4"/>
+              <w:left w:val="single" w:color="D9D4F0" w:sz="4"/>
+              <w:bottom w:val="single" w:color="D9D4F0" w:sz="4"/>
+              <w:right w:val="single" w:color="D9D4F0" w:sz="4"/>
+            </w:tcBorders>
+            <w:tcMar>
+              <w:top w:type="dxa" w:w="80"/>
+              <w:left w:type="dxa" w:w="120"/>
+              <w:bottom w:type="dxa" w:w="80"/>
+              <w:right w:type="dxa" w:w="120"/>
+            </w:tcMar>
+          </w:tcPr>
+          <w:p>
+            <w:r>
+              <w:rPr>
+                <w:b w:val="false"/>
+                <w:bCs w:val="false"/>
+                <w:sz w:val="20"/>
+                <w:szCs w:val="20"/>
+              </w:rPr>
+              <w:t xml:space="preserve">Yes</w:t>
+            </w:r>
+          </w:p>
+        </w:tc>
+        <w:tc>
+          <w:tcPr>
+            <w:tcW w:type="dxa" w:w="1404"/>
+            <w:tcBorders>
+              <w:top w:val="single" w:color="D9D4F0" w:sz="4"/>
+              <w:left w:val="single" w:color="D9D4F0" w:sz="4"/>
+              <w:bottom w:val="single" w:color="D9D4F0" w:sz="4"/>
+              <w:right w:val="single" w:color="D9D4F0" w:sz="4"/>
+            </w:tcBorders>
+            <w:tcMar>
+              <w:top w:type="dxa" w:w="80"/>
+              <w:left w:type="dxa" w:w="120"/>
+              <w:bottom w:type="dxa" w:w="80"/>
+              <w:right w:type="dxa" w:w="120"/>
+            </w:tcMar>
+          </w:tcPr>
+          <w:p>
+            <w:r>
+              <w:rPr>
+                <w:b w:val="false"/>
+                <w:bCs w:val="false"/>
+                <w:sz w:val="20"/>
+                <w:szCs w:val="20"/>
+              </w:rPr>
+              <w:t xml:space="preserve"/>
+            </w:r>
+          </w:p>
+        </w:tc>
+      </w:tr>
+      <w:tr>
+        <w:tc>
+          <w:tcPr>
+            <w:tcW w:type="dxa" w:w="4212"/>
+            <w:tcBorders>
+              <w:top w:val="single" w:color="D9D4F0" w:sz="4"/>
+              <w:left w:val="single" w:color="D9D4F0" w:sz="4"/>
+              <w:bottom w:val="single" w:color="D9D4F0" w:sz="4"/>
+              <w:right w:val="single" w:color="D9D4F0" w:sz="4"/>
+            </w:tcBorders>
+            <w:tcMar>
+              <w:top w:type="dxa" w:w="80"/>
+              <w:left w:type="dxa" w:w="120"/>
+              <w:bottom w:type="dxa" w:w="80"/>
+              <w:right w:type="dxa" w:w="120"/>
+            </w:tcMar>
+          </w:tcPr>
+          <w:p>
+            <w:r>
+              <w:rPr>
+                <w:b w:val="false"/>
+                <w:bCs w:val="false"/>
+                <w:sz w:val="20"/>
+                <w:szCs w:val="20"/>
+              </w:rPr>
+              <w:t xml:space="preserve">Close or extend someone with access</w:t>
+            </w:r>
+          </w:p>
+        </w:tc>
+        <w:tc>
+          <w:tcPr>
+            <w:tcW w:type="dxa" w:w="1872"/>
+            <w:tcBorders>
+              <w:top w:val="single" w:color="D9D4F0" w:sz="4"/>
+              <w:left w:val="single" w:color="D9D4F0" w:sz="4"/>
+              <w:bottom w:val="single" w:color="D9D4F0" w:sz="4"/>
+              <w:right w:val="single" w:color="D9D4F0" w:sz="4"/>
+            </w:tcBorders>
+            <w:tcMar>
+              <w:top w:type="dxa" w:w="80"/>
+              <w:left w:type="dxa" w:w="120"/>
+              <w:bottom w:type="dxa" w:w="80"/>
+              <w:right w:type="dxa" w:w="120"/>
+            </w:tcMar>
+          </w:tcPr>
+          <w:p>
+            <w:r>
+              <w:rPr>
+                <w:b w:val="false"/>
+                <w:bCs w:val="false"/>
+                <w:sz w:val="20"/>
+                <w:szCs w:val="20"/>
+              </w:rPr>
+              <w:t xml:space="preserve"/>
+            </w:r>
+          </w:p>
+        </w:tc>
+        <w:tc>
+          <w:tcPr>
+            <w:tcW w:type="dxa" w:w="1872"/>
+            <w:tcBorders>
+              <w:top w:val="single" w:color="D9D4F0" w:sz="4"/>
+              <w:left w:val="single" w:color="D9D4F0" w:sz="4"/>
+              <w:bottom w:val="single" w:color="D9D4F0" w:sz="4"/>
+              <w:right w:val="single" w:color="D9D4F0" w:sz="4"/>
+            </w:tcBorders>
+            <w:tcMar>
+              <w:top w:type="dxa" w:w="80"/>
+              <w:left w:type="dxa" w:w="120"/>
+              <w:bottom w:type="dxa" w:w="80"/>
+              <w:right w:type="dxa" w:w="120"/>
+            </w:tcMar>
+          </w:tcPr>
+          <w:p>
+            <w:r>
+              <w:rPr>
+                <w:b w:val="false"/>
+                <w:bCs w:val="false"/>
+                <w:sz w:val="20"/>
+                <w:szCs w:val="20"/>
+              </w:rPr>
+              <w:t xml:space="preserve">Yes</w:t>
+            </w:r>
+          </w:p>
+        </w:tc>
+        <w:tc>
+          <w:tcPr>
+            <w:tcW w:type="dxa" w:w="1404"/>
+            <w:tcBorders>
+              <w:top w:val="single" w:color="D9D4F0" w:sz="4"/>
+              <w:left w:val="single" w:color="D9D4F0" w:sz="4"/>
+              <w:bottom w:val="single" w:color="D9D4F0" w:sz="4"/>
+              <w:right w:val="single" w:color="D9D4F0" w:sz="4"/>
+            </w:tcBorders>
+            <w:tcMar>
+              <w:top w:type="dxa" w:w="80"/>
+              <w:left w:type="dxa" w:w="120"/>
+              <w:bottom w:type="dxa" w:w="80"/>
+              <w:right w:type="dxa" w:w="120"/>
+            </w:tcMar>
+          </w:tcPr>
+          <w:p>
+            <w:r>
+              <w:rPr>
+                <w:b w:val="false"/>
+                <w:bCs w:val="false"/>
+                <w:sz w:val="20"/>
+                <w:szCs w:val="20"/>
+              </w:rPr>
+              <w:t xml:space="preserve"/>
+            </w:r>
+          </w:p>
+        </w:tc>
+      </w:tr>
+    </w:tbl>
+    <w:p>
+      <w:pPr>
+        <w:pStyle w:val="Heading2"/>
+        <w:spacing w:after="100" w:before="240"/>
+      </w:pPr>
+      <w:r>
+        <w:rPr>
+          <w:b/>
+          <w:bCs/>
+          <w:color w:val="1B1830"/>
+          <w:sz w:val="26"/>
+          <w:szCs w:val="26"/>
+        </w:rPr>
+        <w:t xml:space="preserve">People who sign up and disappear</w:t>
+      </w:r>
+    </w:p>
+    <w:p>
+      <w:pPr>
+        <w:spacing w:after="100" w:line="300"/>
+      </w:pPr>
+      <w:r>
+        <w:rPr>
+          <w:sz w:val="22"/>
+          <w:szCs w:val="22"/>
+        </w:rPr>
+        <w:t xml:space="preserve">This is the main failure case, so it is handled in steps instead of waiting for the deadline:</w:t>
+      </w:r>
+    </w:p>
+    <w:p>
+      <w:pPr>
+        <w:pStyle w:val="ListParagraph"/>
+        <w:numPr>
+          <w:ilvl w:val="0"/>
+          <w:numId w:val="2"/>
+        </w:numPr>
+        <w:spacing w:after="60" w:line="290"/>
+      </w:pPr>
+      <w:r>
+        <w:rPr>
+          <w:sz w:val="22"/>
+          <w:szCs w:val="22"/>
+        </w:rPr>
+        <w:t xml:space="preserve">Day 2 and no sign-in: an email with a fresh sign-in invite.</w:t>
+      </w:r>
+    </w:p>
+    <w:p>
+      <w:pPr>
+        <w:pStyle w:val="ListParagraph"/>
+        <w:numPr>
+          <w:ilvl w:val="0"/>
+          <w:numId w:val="2"/>
+        </w:numPr>
+        <w:spacing w:after="60" w:line="290"/>
+      </w:pPr>
+      <w:r>
+        <w:rPr>
+          <w:sz w:val="22"/>
+          <w:szCs w:val="22"/>
+        </w:rPr>
+        <w:t xml:space="preserve">Day 4, signed in but never typed anything: an email with three 20-second things to try.</w:t>
+      </w:r>
+    </w:p>
+    <w:p>
+      <w:pPr>
+        <w:pStyle w:val="ListParagraph"/>
+        <w:numPr>
+          <w:ilvl w:val="0"/>
+          <w:numId w:val="2"/>
+        </w:numPr>
+        <w:spacing w:after="60" w:line="290"/>
+      </w:pPr>
+      <w:r>
+        <w:rPr>
+          <w:sz w:val="22"/>
+          <w:szCs w:val="22"/>
+        </w:rPr>
+        <w:t xml:space="preserve">Day 4, 9 and 12: deadline reminders with how many videos are in.</w:t>
+      </w:r>
+    </w:p>
+    <w:p>
+      <w:pPr>
+        <w:pStyle w:val="ListParagraph"/>
+        <w:numPr>
+          <w:ilvl w:val="0"/>
+          <w:numId w:val="2"/>
+        </w:numPr>
+        <w:spacing w:after="60" w:line="290"/>
+      </w:pPr>
+      <w:r>
+        <w:rPr>
+          <w:sz w:val="22"/>
+          <w:szCs w:val="22"/>
+        </w:rPr>
+        <w:t xml:space="preserve">Day 14, fewer than 3 verified: access ends and they are told they can ask for one extension.</w:t>
+      </w:r>
+    </w:p>
+    <w:p>
+      <w:pPr>
+        <w:pStyle w:val="ListParagraph"/>
+        <w:numPr>
+          <w:ilvl w:val="0"/>
+          <w:numId w:val="2"/>
+        </w:numPr>
+        <w:spacing w:after="60" w:line="290"/>
+      </w:pPr>
+      <w:r>
+        <w:rPr>
+          <w:sz w:val="22"/>
+          <w:szCs w:val="22"/>
+        </w:rPr>
+        <w:t xml:space="preserve">Mila OS shows, per creator, whether they have an account and how many messages they have sent, so Sarah sees who is real.</w:t>
+      </w:r>
+    </w:p>
+    <w:p>
+      <w:pPr>
+        <w:pStyle w:val="Heading2"/>
+        <w:spacing w:after="100" w:before="240"/>
+      </w:pPr>
+      <w:r>
+        <w:rPr>
+          <w:b/>
+          <w:bCs/>
+          <w:color w:val="1B1830"/>
+          <w:sz w:val="26"/>
+          <w:szCs w:val="26"/>
+        </w:rPr>
+        <w:t xml:space="preserve">Catching schemers</w:t>
+      </w:r>
+    </w:p>
+    <w:p>
+      <w:pPr>
+        <w:pStyle w:val="ListParagraph"/>
+        <w:numPr>
+          <w:ilvl w:val="0"/>
+          <w:numId w:val="2"/>
+        </w:numPr>
+        <w:spacing w:after="60" w:line="290"/>
+      </w:pPr>
+      <w:r>
+        <w:rPr>
+          <w:sz w:val="22"/>
+          <w:szCs w:val="22"/>
+        </w:rPr>
+        <w:t xml:space="preserve">A creator must have used Mila before the free month: at least 10 messages, or Mila asks you to confirm before it gives the month.</w:t>
+      </w:r>
+    </w:p>
+    <w:p>
+      <w:pPr>
+        <w:pStyle w:val="ListParagraph"/>
+        <w:numPr>
+          <w:ilvl w:val="0"/>
+          <w:numId w:val="2"/>
+        </w:numPr>
+        <w:spacing w:after="60" w:line="290"/>
+      </w:pPr>
+      <w:r>
+        <w:rPr>
+          <w:sz w:val="22"/>
+          <w:szCs w:val="22"/>
+        </w:rPr>
+        <w:t xml:space="preserve">Each video link is checked automatically for the same link sent by another creator, an account that does not match their handle, or a different platform than their profile. Warnings show on the video and you must confirm to verify it anyway.</w:t>
+      </w:r>
+    </w:p>
+    <w:p>
+      <w:pPr>
+        <w:pStyle w:val="ListParagraph"/>
+        <w:numPr>
+          <w:ilvl w:val="0"/>
+          <w:numId w:val="2"/>
+        </w:numPr>
+        <w:spacing w:after="60" w:line="290"/>
+      </w:pPr>
+      <w:r>
+        <w:rPr>
+          <w:sz w:val="22"/>
+          <w:szCs w:val="22"/>
+        </w:rPr>
+        <w:t xml:space="preserve">Four manual boxes per video: shows the real app, says #sponsored, has #milapartner and tags Mila, no income claims.</w:t>
+      </w:r>
+    </w:p>
+    <w:p>
+      <w:pPr>
+        <w:pStyle w:val="ListParagraph"/>
+        <w:numPr>
+          <w:ilvl w:val="0"/>
+          <w:numId w:val="2"/>
+        </w:numPr>
+        <w:spacing w:after="60" w:line="290"/>
+      </w:pPr>
+      <w:r>
+        <w:rPr>
+          <w:sz w:val="22"/>
+          <w:szCs w:val="22"/>
+        </w:rPr>
+        <w:t xml:space="preserve">Handles and emails are unique, so the same person cannot be added twice.</w:t>
+      </w:r>
+    </w:p>
+    <w:p>
+      <w:pPr>
+        <w:pStyle w:val="ListParagraph"/>
+        <w:numPr>
+          <w:ilvl w:val="0"/>
+          <w:numId w:val="2"/>
+        </w:numPr>
+        <w:spacing w:after="60" w:line="290"/>
+      </w:pPr>
+      <w:r>
+        <w:rPr>
+          <w:sz w:val="22"/>
+          <w:szCs w:val="22"/>
+        </w:rPr>
+        <w:t xml:space="preserve">The free month comes after the videos, never before, and a partner signing up under their own code earns nothing.</w:t>
+      </w:r>
+    </w:p>
+    <w:p>
+      <w:pPr>
+        <w:pStyle w:val="ListParagraph"/>
+        <w:numPr>
+          <w:ilvl w:val="0"/>
+          <w:numId w:val="2"/>
+        </w:numPr>
+        <w:spacing w:after="60" w:line="290"/>
+      </w:pPr>
+      <w:r>
+        <w:rPr>
+          <w:sz w:val="22"/>
+          <w:szCs w:val="22"/>
+        </w:rPr>
+        <w:t xml:space="preserve">Commission comes only from payments Mila recorded from Stripe, before tax. Referrals show their email so you can spot odd patterns before you pay.</w:t>
+      </w:r>
+    </w:p>
+    <w:p>
+      <w:pPr>
+        <w:pStyle w:val="Heading2"/>
+        <w:spacing w:after="100" w:before="240"/>
+      </w:pPr>
+      <w:r>
+        <w:rPr>
+          <w:b/>
+          <w:bCs/>
+          <w:color w:val="1B1830"/>
+          <w:sz w:val="26"/>
+          <w:szCs w:val="26"/>
+        </w:rPr>
+        <w:t xml:space="preserve">Do partners pay for Mila?</w:t>
+      </w:r>
+    </w:p>
+    <w:p>
+      <w:pPr>
+        <w:spacing w:after="100" w:line="300"/>
+      </w:pPr>
+      <w:r>
+        <w:rPr>
+          <w:sz w:val="22"/>
+          <w:szCs w:val="22"/>
+        </w:rPr>
+        <w:t xml:space="preserve">My recommendation: no, as long as they post their monthly videos. Their cost to you is capped by the plan's AI ceiling (about $11.50 a month at the very most, usually far less). One paying referral covers that. If a partner stops posting, their free access pauses automatically.</w:t>
+      </w:r>
+    </w:p>
+    <w:tbl>
+      <w:tblPr>
+        <w:tblW w:type="dxa" w:w="9360"/>
+        <w:tblBorders>
+          <w:top w:val="single" w:color="auto" w:sz="4"/>
+          <w:left w:val="single" w:color="auto" w:sz="4"/>
+          <w:bottom w:val="single" w:color="auto" w:sz="4"/>
+          <w:right w:val="single" w:color="auto" w:sz="4"/>
+          <w:insideH w:val="single" w:color="auto" w:sz="4"/>
+          <w:insideV w:val="single" w:color="auto" w:sz="4"/>
+        </w:tblBorders>
+      </w:tblPr>
+      <w:tblGrid>
+        <w:gridCol w:w="6552"/>
+        <w:gridCol w:w="2808"/>
+      </w:tblGrid>
+      <w:tr>
+        <w:trPr>
+          <w:tblHeader/>
+        </w:trPr>
+        <w:tc>
+          <w:tcPr>
+            <w:tcW w:type="dxa" w:w="6552"/>
+            <w:tcBorders>
+              <w:top w:val="single" w:color="D9D4F0" w:sz="4"/>
+              <w:left w:val="single" w:color="D9D4F0" w:sz="4"/>
+              <w:bottom w:val="single" w:color="D9D4F0" w:sz="4"/>
+              <w:right w:val="single" w:color="D9D4F0" w:sz="4"/>
+            </w:tcBorders>
+            <w:shd w:fill="EDE9FE" w:color="auto" w:val="clear"/>
+            <w:tcMar>
+              <w:top w:type="dxa" w:w="80"/>
+              <w:left w:type="dxa" w:w="120"/>
+              <w:bottom w:type="dxa" w:w="80"/>
+              <w:right w:type="dxa" w:w="120"/>
+            </w:tcMar>
+          </w:tcPr>
+          <w:p>
+            <w:r>
+              <w:rPr>
+                <w:b/>
+                <w:bCs/>
+                <w:sz w:val="20"/>
+                <w:szCs w:val="20"/>
+              </w:rPr>
+              <w:t xml:space="preserve">Per $39 monthly customer a partner refers</w:t>
+            </w:r>
+          </w:p>
+        </w:tc>
+        <w:tc>
+          <w:tcPr>
+            <w:tcW w:type="dxa" w:w="2808"/>
+            <w:tcBorders>
+              <w:top w:val="single" w:color="D9D4F0" w:sz="4"/>
+              <w:left w:val="single" w:color="D9D4F0" w:sz="4"/>
+              <w:bottom w:val="single" w:color="D9D4F0" w:sz="4"/>
+              <w:right w:val="single" w:color="D9D4F0" w:sz="4"/>
+            </w:tcBorders>
+            <w:shd w:fill="EDE9FE" w:color="auto" w:val="clear"/>
+            <w:tcMar>
+              <w:top w:type="dxa" w:w="80"/>
+              <w:left w:type="dxa" w:w="120"/>
+              <w:bottom w:type="dxa" w:w="80"/>
+              <w:right w:type="dxa" w:w="120"/>
+            </w:tcMar>
+          </w:tcPr>
+          <w:p>
+            <w:r>
+              <w:rPr>
+                <w:b/>
+                <w:bCs/>
+                <w:sz w:val="20"/>
+                <w:szCs w:val="20"/>
+              </w:rPr>
+              <w:t xml:space="preserve">Amount</w:t>
+            </w:r>
+          </w:p>
+        </w:tc>
+      </w:tr>
+      <w:tr>
+        <w:tc>
+          <w:tcPr>
+            <w:tcW w:type="dxa" w:w="6552"/>
+            <w:tcBorders>
+              <w:top w:val="single" w:color="D9D4F0" w:sz="4"/>
+              <w:left w:val="single" w:color="D9D4F0" w:sz="4"/>
+              <w:bottom w:val="single" w:color="D9D4F0" w:sz="4"/>
+              <w:right w:val="single" w:color="D9D4F0" w:sz="4"/>
+            </w:tcBorders>
+            <w:tcMar>
+              <w:top w:type="dxa" w:w="80"/>
+              <w:left w:type="dxa" w:w="120"/>
+              <w:bottom w:type="dxa" w:w="80"/>
+              <w:right w:type="dxa" w:w="120"/>
+            </w:tcMar>
+          </w:tcPr>
+          <w:p>
+            <w:r>
+              <w:rPr>
+                <w:b w:val="false"/>
+                <w:bCs w:val="false"/>
+                <w:sz w:val="20"/>
+                <w:szCs w:val="20"/>
+              </w:rPr>
+              <w:t xml:space="preserve">Customer pays</w:t>
+            </w:r>
+          </w:p>
+        </w:tc>
+        <w:tc>
+          <w:tcPr>
+            <w:tcW w:type="dxa" w:w="2808"/>
+            <w:tcBorders>
+              <w:top w:val="single" w:color="D9D4F0" w:sz="4"/>
+              <w:left w:val="single" w:color="D9D4F0" w:sz="4"/>
+              <w:bottom w:val="single" w:color="D9D4F0" w:sz="4"/>
+              <w:right w:val="single" w:color="D9D4F0" w:sz="4"/>
+            </w:tcBorders>
+            <w:tcMar>
+              <w:top w:type="dxa" w:w="80"/>
+              <w:left w:type="dxa" w:w="120"/>
+              <w:bottom w:type="dxa" w:w="80"/>
+              <w:right w:type="dxa" w:w="120"/>
+            </w:tcMar>
+          </w:tcPr>
+          <w:p>
+            <w:r>
+              <w:rPr>
+                <w:b w:val="false"/>
+                <w:bCs w:val="false"/>
+                <w:sz w:val="20"/>
+                <w:szCs w:val="20"/>
+              </w:rPr>
+              <w:t xml:space="preserve">$39.00</w:t>
+            </w:r>
+          </w:p>
+        </w:tc>
+      </w:tr>
+      <w:tr>
+        <w:tc>
+          <w:tcPr>
+            <w:tcW w:type="dxa" w:w="6552"/>
+            <w:tcBorders>
+              <w:top w:val="single" w:color="D9D4F0" w:sz="4"/>
+              <w:left w:val="single" w:color="D9D4F0" w:sz="4"/>
+              <w:bottom w:val="single" w:color="D9D4F0" w:sz="4"/>
+              <w:right w:val="single" w:color="D9D4F0" w:sz="4"/>
+            </w:tcBorders>
+            <w:tcMar>
+              <w:top w:type="dxa" w:w="80"/>
+              <w:left w:type="dxa" w:w="120"/>
+              <w:bottom w:type="dxa" w:w="80"/>
+              <w:right w:type="dxa" w:w="120"/>
+            </w:tcMar>
+          </w:tcPr>
+          <w:p>
+            <w:r>
+              <w:rPr>
+                <w:b w:val="false"/>
+                <w:bCs w:val="false"/>
+                <w:sz w:val="20"/>
+                <w:szCs w:val="20"/>
+              </w:rPr>
+              <w:t xml:space="preserve">AI cost at the plan ceiling (worst case)</w:t>
+            </w:r>
+          </w:p>
+        </w:tc>
+        <w:tc>
+          <w:tcPr>
+            <w:tcW w:type="dxa" w:w="2808"/>
+            <w:tcBorders>
+              <w:top w:val="single" w:color="D9D4F0" w:sz="4"/>
+              <w:left w:val="single" w:color="D9D4F0" w:sz="4"/>
+              <w:bottom w:val="single" w:color="D9D4F0" w:sz="4"/>
+              <w:right w:val="single" w:color="D9D4F0" w:sz="4"/>
+            </w:tcBorders>
+            <w:tcMar>
+              <w:top w:type="dxa" w:w="80"/>
+              <w:left w:type="dxa" w:w="120"/>
+              <w:bottom w:type="dxa" w:w="80"/>
+              <w:right w:type="dxa" w:w="120"/>
+            </w:tcMar>
+          </w:tcPr>
+          <w:p>
+            <w:r>
+              <w:rPr>
+                <w:b w:val="false"/>
+                <w:bCs w:val="false"/>
+                <w:sz w:val="20"/>
+                <w:szCs w:val="20"/>
+              </w:rPr>
+              <w:t xml:space="preserve">$11.50</w:t>
+            </w:r>
+          </w:p>
+        </w:tc>
+      </w:tr>
+      <w:tr>
+        <w:tc>
+          <w:tcPr>
+            <w:tcW w:type="dxa" w:w="6552"/>
+            <w:tcBorders>
+              <w:top w:val="single" w:color="D9D4F0" w:sz="4"/>
+              <w:left w:val="single" w:color="D9D4F0" w:sz="4"/>
+              <w:bottom w:val="single" w:color="D9D4F0" w:sz="4"/>
+              <w:right w:val="single" w:color="D9D4F0" w:sz="4"/>
+            </w:tcBorders>
+            <w:tcMar>
+              <w:top w:type="dxa" w:w="80"/>
+              <w:left w:type="dxa" w:w="120"/>
+              <w:bottom w:type="dxa" w:w="80"/>
+              <w:right w:type="dxa" w:w="120"/>
+            </w:tcMar>
+          </w:tcPr>
+          <w:p>
+            <w:r>
+              <w:rPr>
+                <w:b w:val="false"/>
+                <w:bCs w:val="false"/>
+                <w:sz w:val="20"/>
+                <w:szCs w:val="20"/>
+              </w:rPr>
+              <w:t xml:space="preserve">Stripe fees (2.9% + $0.30)</w:t>
+            </w:r>
+          </w:p>
+        </w:tc>
+        <w:tc>
+          <w:tcPr>
+            <w:tcW w:type="dxa" w:w="2808"/>
+            <w:tcBorders>
+              <w:top w:val="single" w:color="D9D4F0" w:sz="4"/>
+              <w:left w:val="single" w:color="D9D4F0" w:sz="4"/>
+              <w:bottom w:val="single" w:color="D9D4F0" w:sz="4"/>
+              <w:right w:val="single" w:color="D9D4F0" w:sz="4"/>
+            </w:tcBorders>
+            <w:tcMar>
+              <w:top w:type="dxa" w:w="80"/>
+              <w:left w:type="dxa" w:w="120"/>
+              <w:bottom w:type="dxa" w:w="80"/>
+              <w:right w:type="dxa" w:w="120"/>
+            </w:tcMar>
+          </w:tcPr>
+          <w:p>
+            <w:r>
+              <w:rPr>
+                <w:b w:val="false"/>
+                <w:bCs w:val="false"/>
+                <w:sz w:val="20"/>
+                <w:szCs w:val="20"/>
+              </w:rPr>
+              <w:t xml:space="preserve">$1.43</w:t>
+            </w:r>
+          </w:p>
+        </w:tc>
+      </w:tr>
+      <w:tr>
+        <w:tc>
+          <w:tcPr>
+            <w:tcW w:type="dxa" w:w="6552"/>
+            <w:tcBorders>
+              <w:top w:val="single" w:color="D9D4F0" w:sz="4"/>
+              <w:left w:val="single" w:color="D9D4F0" w:sz="4"/>
+              <w:bottom w:val="single" w:color="D9D4F0" w:sz="4"/>
+              <w:right w:val="single" w:color="D9D4F0" w:sz="4"/>
+            </w:tcBorders>
+            <w:tcMar>
+              <w:top w:type="dxa" w:w="80"/>
+              <w:left w:type="dxa" w:w="120"/>
+              <w:bottom w:type="dxa" w:w="80"/>
+              <w:right w:type="dxa" w:w="120"/>
+            </w:tcMar>
+          </w:tcPr>
+          <w:p>
+            <w:r>
+              <w:rPr>
+                <w:b w:val="false"/>
+                <w:bCs w:val="false"/>
+                <w:sz w:val="20"/>
+                <w:szCs w:val="20"/>
+              </w:rPr>
+              <w:t xml:space="preserve">Partner commission (20%)</w:t>
+            </w:r>
+          </w:p>
+        </w:tc>
+        <w:tc>
+          <w:tcPr>
+            <w:tcW w:type="dxa" w:w="2808"/>
+            <w:tcBorders>
+              <w:top w:val="single" w:color="D9D4F0" w:sz="4"/>
+              <w:left w:val="single" w:color="D9D4F0" w:sz="4"/>
+              <w:bottom w:val="single" w:color="D9D4F0" w:sz="4"/>
+              <w:right w:val="single" w:color="D9D4F0" w:sz="4"/>
+            </w:tcBorders>
+            <w:tcMar>
+              <w:top w:type="dxa" w:w="80"/>
+              <w:left w:type="dxa" w:w="120"/>
+              <w:bottom w:type="dxa" w:w="80"/>
+              <w:right w:type="dxa" w:w="120"/>
+            </w:tcMar>
+          </w:tcPr>
+          <w:p>
+            <w:r>
+              <w:rPr>
+                <w:b w:val="false"/>
+                <w:bCs w:val="false"/>
+                <w:sz w:val="20"/>
+                <w:szCs w:val="20"/>
+              </w:rPr>
+              <w:t xml:space="preserve">$7.80</w:t>
+            </w:r>
+          </w:p>
+        </w:tc>
+      </w:tr>
+      <w:tr>
+        <w:tc>
+          <w:tcPr>
+            <w:tcW w:type="dxa" w:w="6552"/>
+            <w:tcBorders>
+              <w:top w:val="single" w:color="D9D4F0" w:sz="4"/>
+              <w:left w:val="single" w:color="D9D4F0" w:sz="4"/>
+              <w:bottom w:val="single" w:color="D9D4F0" w:sz="4"/>
+              <w:right w:val="single" w:color="D9D4F0" w:sz="4"/>
+            </w:tcBorders>
+            <w:tcMar>
+              <w:top w:type="dxa" w:w="80"/>
+              <w:left w:type="dxa" w:w="120"/>
+              <w:bottom w:type="dxa" w:w="80"/>
+              <w:right w:type="dxa" w:w="120"/>
+            </w:tcMar>
+          </w:tcPr>
+          <w:p>
+            <w:r>
+              <w:rPr>
+                <w:b w:val="false"/>
+                <w:bCs w:val="false"/>
+                <w:sz w:val="20"/>
+                <w:szCs w:val="20"/>
+              </w:rPr>
+              <w:t xml:space="preserve">What is left for NorthCo</w:t>
+            </w:r>
+          </w:p>
+        </w:tc>
+        <w:tc>
+          <w:tcPr>
+            <w:tcW w:type="dxa" w:w="2808"/>
+            <w:tcBorders>
+              <w:top w:val="single" w:color="D9D4F0" w:sz="4"/>
+              <w:left w:val="single" w:color="D9D4F0" w:sz="4"/>
+              <w:bottom w:val="single" w:color="D9D4F0" w:sz="4"/>
+              <w:right w:val="single" w:color="D9D4F0" w:sz="4"/>
+            </w:tcBorders>
+            <w:tcMar>
+              <w:top w:type="dxa" w:w="80"/>
+              <w:left w:type="dxa" w:w="120"/>
+              <w:bottom w:type="dxa" w:w="80"/>
+              <w:right w:type="dxa" w:w="120"/>
+            </w:tcMar>
+          </w:tcPr>
+          <w:p>
+            <w:r>
+              <w:rPr>
+                <w:b w:val="false"/>
+                <w:bCs w:val="false"/>
+                <w:sz w:val="20"/>
+                <w:szCs w:val="20"/>
+              </w:rPr>
+              <w:t xml:space="preserve">$18.27 (47%)</w:t>
+            </w:r>
+          </w:p>
+        </w:tc>
+      </w:tr>
+    </w:tbl>
+    <w:p>
+      <w:pPr>
+        <w:spacing w:after="100" w:line="300"/>
+      </w:pPr>
+      <w:r>
+        <w:rPr>
+          <w:sz w:val="22"/>
+          <w:szCs w:val="22"/>
+        </w:rPr>
+        <w:t xml:space="preserve">For a $390 annual customer the partner earns $78 once, and NorthCo keeps roughly $186 after about $114 of worst-case AI cost and Stripe fees. A discount instead of free would save you only a few dollars a month per partner and would make partners feel less valued, so free-while-active is the better trade. Revisit with real cost data.</w:t>
+      </w:r>
+    </w:p>
+    <w:p>
+      <w:pPr>
+        <w:pStyle w:val="Heading2"/>
+        <w:spacing w:after="100" w:before="240"/>
+      </w:pPr>
+      <w:r>
+        <w:rPr>
+          <w:b/>
+          <w:bCs/>
+          <w:color w:val="1B1830"/>
+          <w:sz w:val="26"/>
+          <w:szCs w:val="26"/>
+        </w:rPr>
+        <w:t xml:space="preserve">Paying commissions</w:t>
+      </w:r>
+    </w:p>
+    <w:p>
+      <w:pPr>
+        <w:pStyle w:val="ListParagraph"/>
+        <w:numPr>
+          <w:ilvl w:val="0"/>
+          <w:numId w:val="2"/>
+        </w:numPr>
+        <w:spacing w:after="60" w:line="290"/>
+      </w:pPr>
+      <w:r>
+        <w:rPr>
+          <w:sz w:val="22"/>
+          <w:szCs w:val="22"/>
+        </w:rPr>
+        <w:t xml:space="preserve">Mila OS shows each partner's signups, paying customers, commission per month and what is owed.</w:t>
+      </w:r>
+    </w:p>
+    <w:p>
+      <w:pPr>
+        <w:pStyle w:val="ListParagraph"/>
+        <w:numPr>
+          <w:ilvl w:val="0"/>
+          <w:numId w:val="2"/>
+        </w:numPr>
+        <w:spacing w:after="60" w:line="290"/>
+      </w:pPr>
+      <w:r>
+        <w:rPr>
+          <w:sz w:val="22"/>
+          <w:szCs w:val="22"/>
+        </w:rPr>
+        <w:t xml:space="preserve">Suggested rule: pay on the 15th for the previous month, which leaves a 2-week window for refunds or chargebacks.</w:t>
+      </w:r>
+    </w:p>
+    <w:p>
+      <w:pPr>
+        <w:pStyle w:val="ListParagraph"/>
+        <w:numPr>
+          <w:ilvl w:val="0"/>
+          <w:numId w:val="2"/>
+        </w:numPr>
+        <w:spacing w:after="60" w:line="290"/>
+      </w:pPr>
+      <w:r>
+        <w:rPr>
+          <w:sz w:val="22"/>
+          <w:szCs w:val="22"/>
+        </w:rPr>
+        <w:t xml:space="preserve">You send the money yourself (PayPal, Zelle, etc.), then press Record payout so the balance goes down.</w:t>
+      </w:r>
+    </w:p>
+    <w:p>
+      <w:pPr>
+        <w:pStyle w:val="ListParagraph"/>
+        <w:numPr>
+          <w:ilvl w:val="0"/>
+          <w:numId w:val="2"/>
+        </w:numPr>
+        <w:spacing w:after="60" w:line="290"/>
+      </w:pPr>
+      <w:r>
+        <w:rPr>
+          <w:sz w:val="22"/>
+          <w:szCs w:val="22"/>
+        </w:rPr>
+        <w:t xml:space="preserve">Get a W-9 from any partner you pay $600 or more in a year.</w:t>
+      </w:r>
+    </w:p>
+    <w:p>
+      <w:pPr>
+        <w:pStyle w:val="Heading1"/>
+        <w:spacing w:after="140" w:before="360"/>
+      </w:pPr>
+      <w:r>
+        <w:rPr>
+          <w:b/>
+          <w:bCs/>
+          <w:color w:val="3B2FA0"/>
+          <w:sz w:val="34"/>
+          <w:szCs w:val="34"/>
+        </w:rPr>
+        <w:t xml:space="preserve">3c. The video scripts</w:t>
+      </w:r>
+    </w:p>
+    <w:p>
+      <w:pPr>
+        <w:spacing w:after="100" w:line="300"/>
+      </w:pPr>
+      <w:r>
+        <w:rPr>
+          <w:sz w:val="22"/>
+          <w:szCs w:val="22"/>
+        </w:rPr>
+        <w:t xml:space="preserve">Nine scripts are built into the creator's page and into Mila OS (Creators, Scripts and outreach). They share one rule: open with the result in the first two seconds, show the real app, talk like you are showing a friend, say it is sponsored, and end with one line: 7 days free, link in bio.</w:t>
+      </w:r>
+    </w:p>
+    <w:tbl>
+      <w:tblPr>
+        <w:tblW w:type="dxa" w:w="9360"/>
+        <w:tblBorders>
+          <w:top w:val="single" w:color="auto" w:sz="4"/>
+          <w:left w:val="single" w:color="auto" w:sz="4"/>
+          <w:bottom w:val="single" w:color="auto" w:sz="4"/>
+          <w:right w:val="single" w:color="auto" w:sz="4"/>
+          <w:insideH w:val="single" w:color="auto" w:sz="4"/>
+          <w:insideV w:val="single" w:color="auto" w:sz="4"/>
+        </w:tblBorders>
+      </w:tblPr>
+      <w:tblGrid>
+        <w:gridCol w:w="3744"/>
+        <w:gridCol w:w="1123"/>
+        <w:gridCol w:w="4493"/>
+      </w:tblGrid>
+      <w:tr>
+        <w:trPr>
+          <w:tblHeader/>
+        </w:trPr>
+        <w:tc>
+          <w:tcPr>
+            <w:tcW w:type="dxa" w:w="3744"/>
+            <w:tcBorders>
+              <w:top w:val="single" w:color="D9D4F0" w:sz="4"/>
+              <w:left w:val="single" w:color="D9D4F0" w:sz="4"/>
+              <w:bottom w:val="single" w:color="D9D4F0" w:sz="4"/>
+              <w:right w:val="single" w:color="D9D4F0" w:sz="4"/>
+            </w:tcBorders>
+            <w:shd w:fill="EDE9FE" w:color="auto" w:val="clear"/>
+            <w:tcMar>
+              <w:top w:type="dxa" w:w="80"/>
+              <w:left w:type="dxa" w:w="120"/>
+              <w:bottom w:type="dxa" w:w="80"/>
+              <w:right w:type="dxa" w:w="120"/>
+            </w:tcMar>
+          </w:tcPr>
+          <w:p>
+            <w:r>
+              <w:rPr>
+                <w:b/>
+                <w:bCs/>
+                <w:sz w:val="20"/>
+                <w:szCs w:val="20"/>
+              </w:rPr>
+              <w:t xml:space="preserve">Script</w:t>
+            </w:r>
+          </w:p>
+        </w:tc>
+        <w:tc>
+          <w:tcPr>
+            <w:tcW w:type="dxa" w:w="1123"/>
+            <w:tcBorders>
+              <w:top w:val="single" w:color="D9D4F0" w:sz="4"/>
+              <w:left w:val="single" w:color="D9D4F0" w:sz="4"/>
+              <w:bottom w:val="single" w:color="D9D4F0" w:sz="4"/>
+              <w:right w:val="single" w:color="D9D4F0" w:sz="4"/>
+            </w:tcBorders>
+            <w:shd w:fill="EDE9FE" w:color="auto" w:val="clear"/>
+            <w:tcMar>
+              <w:top w:type="dxa" w:w="80"/>
+              <w:left w:type="dxa" w:w="120"/>
+              <w:bottom w:type="dxa" w:w="80"/>
+              <w:right w:type="dxa" w:w="120"/>
+            </w:tcMar>
+          </w:tcPr>
+          <w:p>
+            <w:r>
+              <w:rPr>
+                <w:b/>
+                <w:bCs/>
+                <w:sz w:val="20"/>
+                <w:szCs w:val="20"/>
+              </w:rPr>
+              <w:t xml:space="preserve">Length</w:t>
+            </w:r>
+          </w:p>
+        </w:tc>
+        <w:tc>
+          <w:tcPr>
+            <w:tcW w:type="dxa" w:w="4493"/>
+            <w:tcBorders>
+              <w:top w:val="single" w:color="D9D4F0" w:sz="4"/>
+              <w:left w:val="single" w:color="D9D4F0" w:sz="4"/>
+              <w:bottom w:val="single" w:color="D9D4F0" w:sz="4"/>
+              <w:right w:val="single" w:color="D9D4F0" w:sz="4"/>
+            </w:tcBorders>
+            <w:shd w:fill="EDE9FE" w:color="auto" w:val="clear"/>
+            <w:tcMar>
+              <w:top w:type="dxa" w:w="80"/>
+              <w:left w:type="dxa" w:w="120"/>
+              <w:bottom w:type="dxa" w:w="80"/>
+              <w:right w:type="dxa" w:w="120"/>
+            </w:tcMar>
+          </w:tcPr>
+          <w:p>
+            <w:r>
+              <w:rPr>
+                <w:b/>
+                <w:bCs/>
+                <w:sz w:val="20"/>
+                <w:szCs w:val="20"/>
+              </w:rPr>
+              <w:t xml:space="preserve">Best for</w:t>
+            </w:r>
+          </w:p>
+        </w:tc>
+      </w:tr>
+      <w:tr>
+        <w:tc>
+          <w:tcPr>
+            <w:tcW w:type="dxa" w:w="3744"/>
+            <w:tcBorders>
+              <w:top w:val="single" w:color="D9D4F0" w:sz="4"/>
+              <w:left w:val="single" w:color="D9D4F0" w:sz="4"/>
+              <w:bottom w:val="single" w:color="D9D4F0" w:sz="4"/>
+              <w:right w:val="single" w:color="D9D4F0" w:sz="4"/>
+            </w:tcBorders>
+            <w:tcMar>
+              <w:top w:type="dxa" w:w="80"/>
+              <w:left w:type="dxa" w:w="120"/>
+              <w:bottom w:type="dxa" w:w="80"/>
+              <w:right w:type="dxa" w:w="120"/>
+            </w:tcMar>
+          </w:tcPr>
+          <w:p>
+            <w:r>
+              <w:rPr>
+                <w:b w:val="false"/>
+                <w:bCs w:val="false"/>
+                <w:sz w:val="20"/>
+                <w:szCs w:val="20"/>
+              </w:rPr>
+              <w:t xml:space="preserve">Say it, it's on my calendar</w:t>
+            </w:r>
+          </w:p>
+        </w:tc>
+        <w:tc>
+          <w:tcPr>
+            <w:tcW w:type="dxa" w:w="1123"/>
+            <w:tcBorders>
+              <w:top w:val="single" w:color="D9D4F0" w:sz="4"/>
+              <w:left w:val="single" w:color="D9D4F0" w:sz="4"/>
+              <w:bottom w:val="single" w:color="D9D4F0" w:sz="4"/>
+              <w:right w:val="single" w:color="D9D4F0" w:sz="4"/>
+            </w:tcBorders>
+            <w:tcMar>
+              <w:top w:type="dxa" w:w="80"/>
+              <w:left w:type="dxa" w:w="120"/>
+              <w:bottom w:type="dxa" w:w="80"/>
+              <w:right w:type="dxa" w:w="120"/>
+            </w:tcMar>
+          </w:tcPr>
+          <w:p>
+            <w:r>
+              <w:rPr>
+                <w:b w:val="false"/>
+                <w:bCs w:val="false"/>
+                <w:sz w:val="20"/>
+                <w:szCs w:val="20"/>
+              </w:rPr>
+              <w:t xml:space="preserve">25 sec</w:t>
+            </w:r>
+          </w:p>
+        </w:tc>
+        <w:tc>
+          <w:tcPr>
+            <w:tcW w:type="dxa" w:w="4493"/>
+            <w:tcBorders>
+              <w:top w:val="single" w:color="D9D4F0" w:sz="4"/>
+              <w:left w:val="single" w:color="D9D4F0" w:sz="4"/>
+              <w:bottom w:val="single" w:color="D9D4F0" w:sz="4"/>
+              <w:right w:val="single" w:color="D9D4F0" w:sz="4"/>
+            </w:tcBorders>
+            <w:tcMar>
+              <w:top w:type="dxa" w:w="80"/>
+              <w:left w:type="dxa" w:w="120"/>
+              <w:bottom w:type="dxa" w:w="80"/>
+              <w:right w:type="dxa" w:w="120"/>
+            </w:tcMar>
+          </w:tcPr>
+          <w:p>
+            <w:r>
+              <w:rPr>
+                <w:b w:val="false"/>
+                <w:bCs w:val="false"/>
+                <w:sz w:val="20"/>
+                <w:szCs w:val="20"/>
+              </w:rPr>
+              <w:t xml:space="preserve">Agents. The easiest first video.</w:t>
+            </w:r>
+          </w:p>
+        </w:tc>
+      </w:tr>
+      <w:tr>
+        <w:tc>
+          <w:tcPr>
+            <w:tcW w:type="dxa" w:w="3744"/>
+            <w:tcBorders>
+              <w:top w:val="single" w:color="D9D4F0" w:sz="4"/>
+              <w:left w:val="single" w:color="D9D4F0" w:sz="4"/>
+              <w:bottom w:val="single" w:color="D9D4F0" w:sz="4"/>
+              <w:right w:val="single" w:color="D9D4F0" w:sz="4"/>
+            </w:tcBorders>
+            <w:tcMar>
+              <w:top w:type="dxa" w:w="80"/>
+              <w:left w:type="dxa" w:w="120"/>
+              <w:bottom w:type="dxa" w:w="80"/>
+              <w:right w:type="dxa" w:w="120"/>
+            </w:tcMar>
+          </w:tcPr>
+          <w:p>
+            <w:r>
+              <w:rPr>
+                <w:b w:val="false"/>
+                <w:bCs w:val="false"/>
+                <w:sz w:val="20"/>
+                <w:szCs w:val="20"/>
+              </w:rPr>
+              <w:t xml:space="preserve">A seller net sheet in 10 seconds</w:t>
+            </w:r>
+          </w:p>
+        </w:tc>
+        <w:tc>
+          <w:tcPr>
+            <w:tcW w:type="dxa" w:w="1123"/>
+            <w:tcBorders>
+              <w:top w:val="single" w:color="D9D4F0" w:sz="4"/>
+              <w:left w:val="single" w:color="D9D4F0" w:sz="4"/>
+              <w:bottom w:val="single" w:color="D9D4F0" w:sz="4"/>
+              <w:right w:val="single" w:color="D9D4F0" w:sz="4"/>
+            </w:tcBorders>
+            <w:tcMar>
+              <w:top w:type="dxa" w:w="80"/>
+              <w:left w:type="dxa" w:w="120"/>
+              <w:bottom w:type="dxa" w:w="80"/>
+              <w:right w:type="dxa" w:w="120"/>
+            </w:tcMar>
+          </w:tcPr>
+          <w:p>
+            <w:r>
+              <w:rPr>
+                <w:b w:val="false"/>
+                <w:bCs w:val="false"/>
+                <w:sz w:val="20"/>
+                <w:szCs w:val="20"/>
+              </w:rPr>
+              <w:t xml:space="preserve">20 sec</w:t>
+            </w:r>
+          </w:p>
+        </w:tc>
+        <w:tc>
+          <w:tcPr>
+            <w:tcW w:type="dxa" w:w="4493"/>
+            <w:tcBorders>
+              <w:top w:val="single" w:color="D9D4F0" w:sz="4"/>
+              <w:left w:val="single" w:color="D9D4F0" w:sz="4"/>
+              <w:bottom w:val="single" w:color="D9D4F0" w:sz="4"/>
+              <w:right w:val="single" w:color="D9D4F0" w:sz="4"/>
+            </w:tcBorders>
+            <w:tcMar>
+              <w:top w:type="dxa" w:w="80"/>
+              <w:left w:type="dxa" w:w="120"/>
+              <w:bottom w:type="dxa" w:w="80"/>
+              <w:right w:type="dxa" w:w="120"/>
+            </w:tcMar>
+          </w:tcPr>
+          <w:p>
+            <w:r>
+              <w:rPr>
+                <w:b w:val="false"/>
+                <w:bCs w:val="false"/>
+                <w:sz w:val="20"/>
+                <w:szCs w:val="20"/>
+              </w:rPr>
+              <w:t xml:space="preserve">Listing agents. The number counts up on screen.</w:t>
+            </w:r>
+          </w:p>
+        </w:tc>
+      </w:tr>
+      <w:tr>
+        <w:tc>
+          <w:tcPr>
+            <w:tcW w:type="dxa" w:w="3744"/>
+            <w:tcBorders>
+              <w:top w:val="single" w:color="D9D4F0" w:sz="4"/>
+              <w:left w:val="single" w:color="D9D4F0" w:sz="4"/>
+              <w:bottom w:val="single" w:color="D9D4F0" w:sz="4"/>
+              <w:right w:val="single" w:color="D9D4F0" w:sz="4"/>
+            </w:tcBorders>
+            <w:tcMar>
+              <w:top w:type="dxa" w:w="80"/>
+              <w:left w:type="dxa" w:w="120"/>
+              <w:bottom w:type="dxa" w:w="80"/>
+              <w:right w:type="dxa" w:w="120"/>
+            </w:tcMar>
+          </w:tcPr>
+          <w:p>
+            <w:r>
+              <w:rPr>
+                <w:b w:val="false"/>
+                <w:bCs w:val="false"/>
+                <w:sz w:val="20"/>
+                <w:szCs w:val="20"/>
+              </w:rPr>
+              <w:t xml:space="preserve">The follow-up text I always forgot</w:t>
+            </w:r>
+          </w:p>
+        </w:tc>
+        <w:tc>
+          <w:tcPr>
+            <w:tcW w:type="dxa" w:w="1123"/>
+            <w:tcBorders>
+              <w:top w:val="single" w:color="D9D4F0" w:sz="4"/>
+              <w:left w:val="single" w:color="D9D4F0" w:sz="4"/>
+              <w:bottom w:val="single" w:color="D9D4F0" w:sz="4"/>
+              <w:right w:val="single" w:color="D9D4F0" w:sz="4"/>
+            </w:tcBorders>
+            <w:tcMar>
+              <w:top w:type="dxa" w:w="80"/>
+              <w:left w:type="dxa" w:w="120"/>
+              <w:bottom w:type="dxa" w:w="80"/>
+              <w:right w:type="dxa" w:w="120"/>
+            </w:tcMar>
+          </w:tcPr>
+          <w:p>
+            <w:r>
+              <w:rPr>
+                <w:b w:val="false"/>
+                <w:bCs w:val="false"/>
+                <w:sz w:val="20"/>
+                <w:szCs w:val="20"/>
+              </w:rPr>
+              <w:t xml:space="preserve">30 sec</w:t>
+            </w:r>
+          </w:p>
+        </w:tc>
+        <w:tc>
+          <w:tcPr>
+            <w:tcW w:type="dxa" w:w="4493"/>
+            <w:tcBorders>
+              <w:top w:val="single" w:color="D9D4F0" w:sz="4"/>
+              <w:left w:val="single" w:color="D9D4F0" w:sz="4"/>
+              <w:bottom w:val="single" w:color="D9D4F0" w:sz="4"/>
+              <w:right w:val="single" w:color="D9D4F0" w:sz="4"/>
+            </w:tcBorders>
+            <w:tcMar>
+              <w:top w:type="dxa" w:w="80"/>
+              <w:left w:type="dxa" w:w="120"/>
+              <w:bottom w:type="dxa" w:w="80"/>
+              <w:right w:type="dxa" w:w="120"/>
+            </w:tcMar>
+          </w:tcPr>
+          <w:p>
+            <w:r>
+              <w:rPr>
+                <w:b w:val="false"/>
+                <w:bCs w:val="false"/>
+                <w:sz w:val="20"/>
+                <w:szCs w:val="20"/>
+              </w:rPr>
+              <w:t xml:space="preserve">New agents. Story first, product second.</w:t>
+            </w:r>
+          </w:p>
+        </w:tc>
+      </w:tr>
+      <w:tr>
+        <w:tc>
+          <w:tcPr>
+            <w:tcW w:type="dxa" w:w="3744"/>
+            <w:tcBorders>
+              <w:top w:val="single" w:color="D9D4F0" w:sz="4"/>
+              <w:left w:val="single" w:color="D9D4F0" w:sz="4"/>
+              <w:bottom w:val="single" w:color="D9D4F0" w:sz="4"/>
+              <w:right w:val="single" w:color="D9D4F0" w:sz="4"/>
+            </w:tcBorders>
+            <w:tcMar>
+              <w:top w:type="dxa" w:w="80"/>
+              <w:left w:type="dxa" w:w="120"/>
+              <w:bottom w:type="dxa" w:w="80"/>
+              <w:right w:type="dxa" w:w="120"/>
+            </w:tcMar>
+          </w:tcPr>
+          <w:p>
+            <w:r>
+              <w:rPr>
+                <w:b w:val="false"/>
+                <w:bCs w:val="false"/>
+                <w:sz w:val="20"/>
+                <w:szCs w:val="20"/>
+              </w:rPr>
+              <w:t xml:space="preserve">My Sunday night planning in 30 seconds</w:t>
+            </w:r>
+          </w:p>
+        </w:tc>
+        <w:tc>
+          <w:tcPr>
+            <w:tcW w:type="dxa" w:w="1123"/>
+            <w:tcBorders>
+              <w:top w:val="single" w:color="D9D4F0" w:sz="4"/>
+              <w:left w:val="single" w:color="D9D4F0" w:sz="4"/>
+              <w:bottom w:val="single" w:color="D9D4F0" w:sz="4"/>
+              <w:right w:val="single" w:color="D9D4F0" w:sz="4"/>
+            </w:tcBorders>
+            <w:tcMar>
+              <w:top w:type="dxa" w:w="80"/>
+              <w:left w:type="dxa" w:w="120"/>
+              <w:bottom w:type="dxa" w:w="80"/>
+              <w:right w:type="dxa" w:w="120"/>
+            </w:tcMar>
+          </w:tcPr>
+          <w:p>
+            <w:r>
+              <w:rPr>
+                <w:b w:val="false"/>
+                <w:bCs w:val="false"/>
+                <w:sz w:val="20"/>
+                <w:szCs w:val="20"/>
+              </w:rPr>
+              <w:t xml:space="preserve">30 sec</w:t>
+            </w:r>
+          </w:p>
+        </w:tc>
+        <w:tc>
+          <w:tcPr>
+            <w:tcW w:type="dxa" w:w="4493"/>
+            <w:tcBorders>
+              <w:top w:val="single" w:color="D9D4F0" w:sz="4"/>
+              <w:left w:val="single" w:color="D9D4F0" w:sz="4"/>
+              <w:bottom w:val="single" w:color="D9D4F0" w:sz="4"/>
+              <w:right w:val="single" w:color="D9D4F0" w:sz="4"/>
+            </w:tcBorders>
+            <w:tcMar>
+              <w:top w:type="dxa" w:w="80"/>
+              <w:left w:type="dxa" w:w="120"/>
+              <w:bottom w:type="dxa" w:w="80"/>
+              <w:right w:type="dxa" w:w="120"/>
+            </w:tcMar>
+          </w:tcPr>
+          <w:p>
+            <w:r>
+              <w:rPr>
+                <w:b w:val="false"/>
+                <w:bCs w:val="false"/>
+                <w:sz w:val="20"/>
+                <w:szCs w:val="20"/>
+              </w:rPr>
+              <w:t xml:space="preserve">Anyone busy. Before and after.</w:t>
+            </w:r>
+          </w:p>
+        </w:tc>
+      </w:tr>
+      <w:tr>
+        <w:tc>
+          <w:tcPr>
+            <w:tcW w:type="dxa" w:w="3744"/>
+            <w:tcBorders>
+              <w:top w:val="single" w:color="D9D4F0" w:sz="4"/>
+              <w:left w:val="single" w:color="D9D4F0" w:sz="4"/>
+              <w:bottom w:val="single" w:color="D9D4F0" w:sz="4"/>
+              <w:right w:val="single" w:color="D9D4F0" w:sz="4"/>
+            </w:tcBorders>
+            <w:tcMar>
+              <w:top w:type="dxa" w:w="80"/>
+              <w:left w:type="dxa" w:w="120"/>
+              <w:bottom w:type="dxa" w:w="80"/>
+              <w:right w:type="dxa" w:w="120"/>
+            </w:tcMar>
+          </w:tcPr>
+          <w:p>
+            <w:r>
+              <w:rPr>
+                <w:b w:val="false"/>
+                <w:bCs w:val="false"/>
+                <w:sz w:val="20"/>
+                <w:szCs w:val="20"/>
+              </w:rPr>
+              <w:t xml:space="preserve">An open house from one sentence</w:t>
+            </w:r>
+          </w:p>
+        </w:tc>
+        <w:tc>
+          <w:tcPr>
+            <w:tcW w:type="dxa" w:w="1123"/>
+            <w:tcBorders>
+              <w:top w:val="single" w:color="D9D4F0" w:sz="4"/>
+              <w:left w:val="single" w:color="D9D4F0" w:sz="4"/>
+              <w:bottom w:val="single" w:color="D9D4F0" w:sz="4"/>
+              <w:right w:val="single" w:color="D9D4F0" w:sz="4"/>
+            </w:tcBorders>
+            <w:tcMar>
+              <w:top w:type="dxa" w:w="80"/>
+              <w:left w:type="dxa" w:w="120"/>
+              <w:bottom w:type="dxa" w:w="80"/>
+              <w:right w:type="dxa" w:w="120"/>
+            </w:tcMar>
+          </w:tcPr>
+          <w:p>
+            <w:r>
+              <w:rPr>
+                <w:b w:val="false"/>
+                <w:bCs w:val="false"/>
+                <w:sz w:val="20"/>
+                <w:szCs w:val="20"/>
+              </w:rPr>
+              <w:t xml:space="preserve">30 sec</w:t>
+            </w:r>
+          </w:p>
+        </w:tc>
+        <w:tc>
+          <w:tcPr>
+            <w:tcW w:type="dxa" w:w="4493"/>
+            <w:tcBorders>
+              <w:top w:val="single" w:color="D9D4F0" w:sz="4"/>
+              <w:left w:val="single" w:color="D9D4F0" w:sz="4"/>
+              <w:bottom w:val="single" w:color="D9D4F0" w:sz="4"/>
+              <w:right w:val="single" w:color="D9D4F0" w:sz="4"/>
+            </w:tcBorders>
+            <w:tcMar>
+              <w:top w:type="dxa" w:w="80"/>
+              <w:left w:type="dxa" w:w="120"/>
+              <w:bottom w:type="dxa" w:w="80"/>
+              <w:right w:type="dxa" w:w="120"/>
+            </w:tcMar>
+          </w:tcPr>
+          <w:p>
+            <w:r>
+              <w:rPr>
+                <w:b w:val="false"/>
+                <w:bCs w:val="false"/>
+                <w:sz w:val="20"/>
+                <w:szCs w:val="20"/>
+              </w:rPr>
+              <w:t xml:space="preserve">Agents who hold opens.</w:t>
+            </w:r>
+          </w:p>
+        </w:tc>
+      </w:tr>
+      <w:tr>
+        <w:tc>
+          <w:tcPr>
+            <w:tcW w:type="dxa" w:w="3744"/>
+            <w:tcBorders>
+              <w:top w:val="single" w:color="D9D4F0" w:sz="4"/>
+              <w:left w:val="single" w:color="D9D4F0" w:sz="4"/>
+              <w:bottom w:val="single" w:color="D9D4F0" w:sz="4"/>
+              <w:right w:val="single" w:color="D9D4F0" w:sz="4"/>
+            </w:tcBorders>
+            <w:tcMar>
+              <w:top w:type="dxa" w:w="80"/>
+              <w:left w:type="dxa" w:w="120"/>
+              <w:bottom w:type="dxa" w:w="80"/>
+              <w:right w:type="dxa" w:w="120"/>
+            </w:tcMar>
+          </w:tcPr>
+          <w:p>
+            <w:r>
+              <w:rPr>
+                <w:b w:val="false"/>
+                <w:bCs w:val="false"/>
+                <w:sz w:val="20"/>
+                <w:szCs w:val="20"/>
+              </w:rPr>
+              <w:t xml:space="preserve">What if rates drop?</w:t>
+            </w:r>
+          </w:p>
+        </w:tc>
+        <w:tc>
+          <w:tcPr>
+            <w:tcW w:type="dxa" w:w="1123"/>
+            <w:tcBorders>
+              <w:top w:val="single" w:color="D9D4F0" w:sz="4"/>
+              <w:left w:val="single" w:color="D9D4F0" w:sz="4"/>
+              <w:bottom w:val="single" w:color="D9D4F0" w:sz="4"/>
+              <w:right w:val="single" w:color="D9D4F0" w:sz="4"/>
+            </w:tcBorders>
+            <w:tcMar>
+              <w:top w:type="dxa" w:w="80"/>
+              <w:left w:type="dxa" w:w="120"/>
+              <w:bottom w:type="dxa" w:w="80"/>
+              <w:right w:type="dxa" w:w="120"/>
+            </w:tcMar>
+          </w:tcPr>
+          <w:p>
+            <w:r>
+              <w:rPr>
+                <w:b w:val="false"/>
+                <w:bCs w:val="false"/>
+                <w:sz w:val="20"/>
+                <w:szCs w:val="20"/>
+              </w:rPr>
+              <w:t xml:space="preserve">20 sec</w:t>
+            </w:r>
+          </w:p>
+        </w:tc>
+        <w:tc>
+          <w:tcPr>
+            <w:tcW w:type="dxa" w:w="4493"/>
+            <w:tcBorders>
+              <w:top w:val="single" w:color="D9D4F0" w:sz="4"/>
+              <w:left w:val="single" w:color="D9D4F0" w:sz="4"/>
+              <w:bottom w:val="single" w:color="D9D4F0" w:sz="4"/>
+              <w:right w:val="single" w:color="D9D4F0" w:sz="4"/>
+            </w:tcBorders>
+            <w:tcMar>
+              <w:top w:type="dxa" w:w="80"/>
+              <w:left w:type="dxa" w:w="120"/>
+              <w:bottom w:type="dxa" w:w="80"/>
+              <w:right w:type="dxa" w:w="120"/>
+            </w:tcMar>
+          </w:tcPr>
+          <w:p>
+            <w:r>
+              <w:rPr>
+                <w:b w:val="false"/>
+                <w:bCs w:val="false"/>
+                <w:sz w:val="20"/>
+                <w:szCs w:val="20"/>
+              </w:rPr>
+              <w:t xml:space="preserve">Buyer's agents and loan officers.</w:t>
+            </w:r>
+          </w:p>
+        </w:tc>
+      </w:tr>
+      <w:tr>
+        <w:tc>
+          <w:tcPr>
+            <w:tcW w:type="dxa" w:w="3744"/>
+            <w:tcBorders>
+              <w:top w:val="single" w:color="D9D4F0" w:sz="4"/>
+              <w:left w:val="single" w:color="D9D4F0" w:sz="4"/>
+              <w:bottom w:val="single" w:color="D9D4F0" w:sz="4"/>
+              <w:right w:val="single" w:color="D9D4F0" w:sz="4"/>
+            </w:tcBorders>
+            <w:tcMar>
+              <w:top w:type="dxa" w:w="80"/>
+              <w:left w:type="dxa" w:w="120"/>
+              <w:bottom w:type="dxa" w:w="80"/>
+              <w:right w:type="dxa" w:w="120"/>
+            </w:tcMar>
+          </w:tcPr>
+          <w:p>
+            <w:r>
+              <w:rPr>
+                <w:b w:val="false"/>
+                <w:bCs w:val="false"/>
+                <w:sz w:val="20"/>
+                <w:szCs w:val="20"/>
+              </w:rPr>
+              <w:t xml:space="preserve">Honest review: an AI assistant for agents</w:t>
+            </w:r>
+          </w:p>
+        </w:tc>
+        <w:tc>
+          <w:tcPr>
+            <w:tcW w:type="dxa" w:w="1123"/>
+            <w:tcBorders>
+              <w:top w:val="single" w:color="D9D4F0" w:sz="4"/>
+              <w:left w:val="single" w:color="D9D4F0" w:sz="4"/>
+              <w:bottom w:val="single" w:color="D9D4F0" w:sz="4"/>
+              <w:right w:val="single" w:color="D9D4F0" w:sz="4"/>
+            </w:tcBorders>
+            <w:tcMar>
+              <w:top w:type="dxa" w:w="80"/>
+              <w:left w:type="dxa" w:w="120"/>
+              <w:bottom w:type="dxa" w:w="80"/>
+              <w:right w:type="dxa" w:w="120"/>
+            </w:tcMar>
+          </w:tcPr>
+          <w:p>
+            <w:r>
+              <w:rPr>
+                <w:b w:val="false"/>
+                <w:bCs w:val="false"/>
+                <w:sz w:val="20"/>
+                <w:szCs w:val="20"/>
+              </w:rPr>
+              <w:t xml:space="preserve">35 sec</w:t>
+            </w:r>
+          </w:p>
+        </w:tc>
+        <w:tc>
+          <w:tcPr>
+            <w:tcW w:type="dxa" w:w="4493"/>
+            <w:tcBorders>
+              <w:top w:val="single" w:color="D9D4F0" w:sz="4"/>
+              <w:left w:val="single" w:color="D9D4F0" w:sz="4"/>
+              <w:bottom w:val="single" w:color="D9D4F0" w:sz="4"/>
+              <w:right w:val="single" w:color="D9D4F0" w:sz="4"/>
+            </w:tcBorders>
+            <w:tcMar>
+              <w:top w:type="dxa" w:w="80"/>
+              <w:left w:type="dxa" w:w="120"/>
+              <w:bottom w:type="dxa" w:w="80"/>
+              <w:right w:type="dxa" w:w="120"/>
+            </w:tcMar>
+          </w:tcPr>
+          <w:p>
+            <w:r>
+              <w:rPr>
+                <w:b w:val="false"/>
+                <w:bCs w:val="false"/>
+                <w:sz w:val="20"/>
+                <w:szCs w:val="20"/>
+              </w:rPr>
+              <w:t xml:space="preserve">Non-agent creators. Includes one honest limit.</w:t>
+            </w:r>
+          </w:p>
+        </w:tc>
+      </w:tr>
+      <w:tr>
+        <w:tc>
+          <w:tcPr>
+            <w:tcW w:type="dxa" w:w="3744"/>
+            <w:tcBorders>
+              <w:top w:val="single" w:color="D9D4F0" w:sz="4"/>
+              <w:left w:val="single" w:color="D9D4F0" w:sz="4"/>
+              <w:bottom w:val="single" w:color="D9D4F0" w:sz="4"/>
+              <w:right w:val="single" w:color="D9D4F0" w:sz="4"/>
+            </w:tcBorders>
+            <w:tcMar>
+              <w:top w:type="dxa" w:w="80"/>
+              <w:left w:type="dxa" w:w="120"/>
+              <w:bottom w:type="dxa" w:w="80"/>
+              <w:right w:type="dxa" w:w="120"/>
+            </w:tcMar>
+          </w:tcPr>
+          <w:p>
+            <w:r>
+              <w:rPr>
+                <w:b w:val="false"/>
+                <w:bCs w:val="false"/>
+                <w:sz w:val="20"/>
+                <w:szCs w:val="20"/>
+              </w:rPr>
+              <w:t xml:space="preserve">A day with an AI chief of staff</w:t>
+            </w:r>
+          </w:p>
+        </w:tc>
+        <w:tc>
+          <w:tcPr>
+            <w:tcW w:type="dxa" w:w="1123"/>
+            <w:tcBorders>
+              <w:top w:val="single" w:color="D9D4F0" w:sz="4"/>
+              <w:left w:val="single" w:color="D9D4F0" w:sz="4"/>
+              <w:bottom w:val="single" w:color="D9D4F0" w:sz="4"/>
+              <w:right w:val="single" w:color="D9D4F0" w:sz="4"/>
+            </w:tcBorders>
+            <w:tcMar>
+              <w:top w:type="dxa" w:w="80"/>
+              <w:left w:type="dxa" w:w="120"/>
+              <w:bottom w:type="dxa" w:w="80"/>
+              <w:right w:type="dxa" w:w="120"/>
+            </w:tcMar>
+          </w:tcPr>
+          <w:p>
+            <w:r>
+              <w:rPr>
+                <w:b w:val="false"/>
+                <w:bCs w:val="false"/>
+                <w:sz w:val="20"/>
+                <w:szCs w:val="20"/>
+              </w:rPr>
+              <w:t xml:space="preserve">45 sec</w:t>
+            </w:r>
+          </w:p>
+        </w:tc>
+        <w:tc>
+          <w:tcPr>
+            <w:tcW w:type="dxa" w:w="4493"/>
+            <w:tcBorders>
+              <w:top w:val="single" w:color="D9D4F0" w:sz="4"/>
+              <w:left w:val="single" w:color="D9D4F0" w:sz="4"/>
+              <w:bottom w:val="single" w:color="D9D4F0" w:sz="4"/>
+              <w:right w:val="single" w:color="D9D4F0" w:sz="4"/>
+            </w:tcBorders>
+            <w:tcMar>
+              <w:top w:type="dxa" w:w="80"/>
+              <w:left w:type="dxa" w:w="120"/>
+              <w:bottom w:type="dxa" w:w="80"/>
+              <w:right w:type="dxa" w:w="120"/>
+            </w:tcMar>
+          </w:tcPr>
+          <w:p>
+            <w:r>
+              <w:rPr>
+                <w:b w:val="false"/>
+                <w:bCs w:val="false"/>
+                <w:sz w:val="20"/>
+                <w:szCs w:val="20"/>
+              </w:rPr>
+              <w:t xml:space="preserve">Day-in-the-life creators.</w:t>
+            </w:r>
+          </w:p>
+        </w:tc>
+      </w:tr>
+      <w:tr>
+        <w:tc>
+          <w:tcPr>
+            <w:tcW w:type="dxa" w:w="3744"/>
+            <w:tcBorders>
+              <w:top w:val="single" w:color="D9D4F0" w:sz="4"/>
+              <w:left w:val="single" w:color="D9D4F0" w:sz="4"/>
+              <w:bottom w:val="single" w:color="D9D4F0" w:sz="4"/>
+              <w:right w:val="single" w:color="D9D4F0" w:sz="4"/>
+            </w:tcBorders>
+            <w:tcMar>
+              <w:top w:type="dxa" w:w="80"/>
+              <w:left w:type="dxa" w:w="120"/>
+              <w:bottom w:type="dxa" w:w="80"/>
+              <w:right w:type="dxa" w:w="120"/>
+            </w:tcMar>
+          </w:tcPr>
+          <w:p>
+            <w:r>
+              <w:rPr>
+                <w:b w:val="false"/>
+                <w:bCs w:val="false"/>
+                <w:sz w:val="20"/>
+                <w:szCs w:val="20"/>
+              </w:rPr>
+              <w:t xml:space="preserve">Reply to a comment: does it text for you?</w:t>
+            </w:r>
+          </w:p>
+        </w:tc>
+        <w:tc>
+          <w:tcPr>
+            <w:tcW w:type="dxa" w:w="1123"/>
+            <w:tcBorders>
+              <w:top w:val="single" w:color="D9D4F0" w:sz="4"/>
+              <w:left w:val="single" w:color="D9D4F0" w:sz="4"/>
+              <w:bottom w:val="single" w:color="D9D4F0" w:sz="4"/>
+              <w:right w:val="single" w:color="D9D4F0" w:sz="4"/>
+            </w:tcBorders>
+            <w:tcMar>
+              <w:top w:type="dxa" w:w="80"/>
+              <w:left w:type="dxa" w:w="120"/>
+              <w:bottom w:type="dxa" w:w="80"/>
+              <w:right w:type="dxa" w:w="120"/>
+            </w:tcMar>
+          </w:tcPr>
+          <w:p>
+            <w:r>
+              <w:rPr>
+                <w:b w:val="false"/>
+                <w:bCs w:val="false"/>
+                <w:sz w:val="20"/>
+                <w:szCs w:val="20"/>
+              </w:rPr>
+              <w:t xml:space="preserve">15 sec</w:t>
+            </w:r>
+          </w:p>
+        </w:tc>
+        <w:tc>
+          <w:tcPr>
+            <w:tcW w:type="dxa" w:w="4493"/>
+            <w:tcBorders>
+              <w:top w:val="single" w:color="D9D4F0" w:sz="4"/>
+              <w:left w:val="single" w:color="D9D4F0" w:sz="4"/>
+              <w:bottom w:val="single" w:color="D9D4F0" w:sz="4"/>
+              <w:right w:val="single" w:color="D9D4F0" w:sz="4"/>
+            </w:tcBorders>
+            <w:tcMar>
+              <w:top w:type="dxa" w:w="80"/>
+              <w:left w:type="dxa" w:w="120"/>
+              <w:bottom w:type="dxa" w:w="80"/>
+              <w:right w:type="dxa" w:w="120"/>
+            </w:tcMar>
+          </w:tcPr>
+          <w:p>
+            <w:r>
+              <w:rPr>
+                <w:b w:val="false"/>
+                <w:bCs w:val="false"/>
+                <w:sz w:val="20"/>
+                <w:szCs w:val="20"/>
+              </w:rPr>
+              <w:t xml:space="preserve">Anyone, after their first video. Builds trust.</w:t>
+            </w:r>
+          </w:p>
+        </w:tc>
+      </w:tr>
+    </w:tbl>
+    <w:p>
+      <w:pPr>
+        <w:spacing w:after="100" w:line="300"/>
+      </w:pPr>
+      <w:r>
+        <w:rPr>
+          <w:sz w:val="22"/>
+          <w:szCs w:val="22"/>
+        </w:rPr>
+        <w:t xml:space="preserve">Mila OS also has outreach messages for Sarah (first message, follow-up, the yes reply, a quiet-creator nudge and the partner invite) and a list of good signs and red flags for choosing who to invite.</w:t>
+      </w:r>
+    </w:p>
+    <w:p>
+      <w:pPr>
+        <w:pStyle w:val="Heading1"/>
+        <w:spacing w:after="140" w:before="360"/>
+      </w:pPr>
+      <w:r>
+        <w:rPr>
+          <w:b/>
+          <w:bCs/>
+          <w:color w:val="3B2FA0"/>
+          <w:sz w:val="34"/>
+          <w:szCs w:val="34"/>
+        </w:rPr>
         <w:t xml:space="preserve">4. What you need to do</w:t>
       </w:r>
     </w:p>
@@ -1932,7 +5221,7 @@
                 <w:sz w:val="20"/>
                 <w:szCs w:val="20"/>
               </w:rPr>
-              <w:t xml:space="preserve">Run the creators migration (supabase/migrations/0014_creators.sql) once.</w:t>
+              <w:t xml:space="preserve">Run supabase/migrations/0015_creator_partners.sql once (0014 is already done).</w:t>
             </w:r>
           </w:p>
         </w:tc>
@@ -2018,7 +5307,7 @@
                 <w:sz w:val="20"/>
                 <w:szCs w:val="20"/>
               </w:rPr>
-              <w:t xml:space="preserve">Add CRON_SECRET to the Mila OS project (same long random value you used for the app) and RESEND_API_KEY if it is missing. Redeploy Mila OS.</w:t>
+              <w:t xml:space="preserve">In the Mila OS project add CRON_SECRET (a long random value) and keep RESEND_API_KEY. Redeploy Mila OS and the app.</w:t>
             </w:r>
           </w:p>
         </w:tc>
@@ -2046,7 +5335,7 @@
                 <w:sz w:val="20"/>
                 <w:szCs w:val="20"/>
               </w:rPr>
-              <w:t xml:space="preserve">Vercel, Mila OS project</w:t>
+              <w:t xml:space="preserve">Vercel, Mila OS and app projects</w:t>
             </w:r>
           </w:p>
         </w:tc>
@@ -2190,7 +5479,7 @@
                 <w:sz w:val="20"/>
                 <w:szCs w:val="20"/>
               </w:rPr>
-              <w:t xml:space="preserve">Add your first 5 to 10 creators in Mila OS, Growth, Creators. Press Grant access when you are ready.</w:t>
+              <w:t xml:space="preserve">Have Sarah sign in to Mila OS, choose Sarah, and start from Growth, Creators, Scripts and outreach. Add 5 to 10 creators to begin.</w:t>
             </w:r>
           </w:p>
         </w:tc>

</xml_diff>